<commit_message>
Limit email DOCX resource to addresses only
</commit_message>
<xml_diff>
--- a/app/src/main/res/raw/email_docx.docx
+++ b/app/src/main/res/raw/email_docx.docx
@@ -3,3258 +3,113 @@
 <w:document xmlns:wpc="http://schemas.microsoft.com/office/word/2010/wordprocessingCanvas" xmlns:mo="http://schemas.microsoft.com/office/mac/office/2008/main" xmlns:mc="http://schemas.openxmlformats.org/markup-compatibility/2006" xmlns:mv="urn:schemas-microsoft-com:mac:vml" xmlns:o="urn:schemas-microsoft-com:office:office" xmlns:r="http://schemas.openxmlformats.org/officeDocument/2006/relationships" xmlns:m="http://schemas.openxmlformats.org/officeDocument/2006/math" xmlns:v="urn:schemas-microsoft-com:vml" xmlns:wp14="http://schemas.microsoft.com/office/word/2010/wordprocessingDrawing" xmlns:wp="http://schemas.openxmlformats.org/drawingml/2006/wordprocessingDrawing" xmlns:w10="urn:schemas-microsoft-com:office:word" xmlns:w="http://schemas.openxmlformats.org/wordprocessingml/2006/main" xmlns:w14="http://schemas.microsoft.com/office/word/2010/wordml" xmlns:wpg="http://schemas.microsoft.com/office/word/2010/wordprocessingGroup" xmlns:wpi="http://schemas.microsoft.com/office/word/2010/wordprocessingInk" xmlns:wne="http://schemas.microsoft.com/office/word/2006/wordml" xmlns:wps="http://schemas.microsoft.com/office/word/2010/wordprocessingShape" mc:Ignorable="w14 wp14">
   <w:body>
     <w:p>
-      <w:pPr>
-        <w:spacing w:after="60"/>
-      </w:pPr>
       <w:r>
-        <w:rPr>
-          <w:rFonts w:ascii="Calibri" w:hAnsi="Calibri"/>
-          <w:b/>
-          <w:color w:val="0B2545"/>
-          <w:sz w:val="44"/>
-        </w:rPr>
-        <w:t>Email</w:t>
+        <w:t>orders@maraglobalfoods.com.au</w:t>
       </w:r>
     </w:p>
     <w:p>
-      <w:pPr>
-        <w:spacing w:after="240"/>
-      </w:pPr>
       <w:r>
-        <w:rPr>
-          <w:rFonts w:ascii="Calibri" w:hAnsi="Calibri"/>
-          <w:color w:val="555555"/>
-          <w:sz w:val="20"/>
-        </w:rPr>
-        <w:t>Email-only outreach resource generated from app/src/main/res/raw/email.json</w:t>
+        <w:t>sales@hyfeed.com.au</w:t>
       </w:r>
     </w:p>
-    <w:tbl>
-      <w:tblPr>
-        <w:tblW w:type="auto" w:w="0"/>
-        <w:jc w:val="left"/>
-        <w:tblLayout w:type="fixed"/>
-        <w:tblLook w:firstColumn="1" w:firstRow="1" w:lastColumn="0" w:lastRow="0" w:noHBand="0" w:noVBand="1" w:val="04A0"/>
-        <w:tblBorders>
-          <w:top w:val="single" w:sz="4" w:space="0" w:color="D9E1EA"/>
-          <w:left w:val="single" w:sz="4" w:space="0" w:color="D9E1EA"/>
-          <w:bottom w:val="single" w:sz="4" w:space="0" w:color="D9E1EA"/>
-          <w:right w:val="single" w:sz="4" w:space="0" w:color="D9E1EA"/>
-          <w:insideH w:val="single" w:sz="4" w:space="0" w:color="D9E1EA"/>
-          <w:insideV w:val="single" w:sz="4" w:space="0" w:color="D9E1EA"/>
-        </w:tblBorders>
-      </w:tblPr>
-      <w:tblGrid>
-        <w:gridCol w:w="4680"/>
-        <w:gridCol w:w="4680"/>
-      </w:tblGrid>
-      <w:tr>
-        <w:tc>
-          <w:tcPr>
-            <w:tcW w:type="dxa" w:w="4680"/>
-            <w:shd w:fill="E8EEF5"/>
-            <w:tcMar>
-              <w:top w:w="80" w:type="dxa"/>
-              <w:start w:w="120" w:type="dxa"/>
-              <w:bottom w:w="80" w:type="dxa"/>
-              <w:end w:w="120" w:type="dxa"/>
-            </w:tcMar>
-          </w:tcPr>
-          <w:p>
-            <w:r>
-              <w:rPr>
-                <w:sz w:val="18"/>
-              </w:rPr>
-              <w:t>Generated</w:t>
-            </w:r>
-          </w:p>
-        </w:tc>
-        <w:tc>
-          <w:tcPr>
-            <w:tcW w:type="dxa" w:w="4680"/>
-            <w:tcMar>
-              <w:top w:w="80" w:type="dxa"/>
-              <w:start w:w="120" w:type="dxa"/>
-              <w:bottom w:w="80" w:type="dxa"/>
-              <w:end w:w="120" w:type="dxa"/>
-            </w:tcMar>
-          </w:tcPr>
-          <w:p>
-            <w:r>
-              <w:rPr>
-                <w:sz w:val="18"/>
-              </w:rPr>
-              <w:t>2026-08-17</w:t>
-            </w:r>
-          </w:p>
-        </w:tc>
-      </w:tr>
-      <w:tr>
-        <w:tc>
-          <w:tcPr>
-            <w:tcW w:type="dxa" w:w="4680"/>
-            <w:shd w:fill="E8EEF5"/>
-            <w:tcMar>
-              <w:top w:w="80" w:type="dxa"/>
-              <w:start w:w="120" w:type="dxa"/>
-              <w:bottom w:w="80" w:type="dxa"/>
-              <w:end w:w="120" w:type="dxa"/>
-            </w:tcMar>
-          </w:tcPr>
-          <w:p>
-            <w:r>
-              <w:rPr>
-                <w:sz w:val="18"/>
-              </w:rPr>
-              <w:t>Companies</w:t>
-            </w:r>
-          </w:p>
-        </w:tc>
-        <w:tc>
-          <w:tcPr>
-            <w:tcW w:type="dxa" w:w="4680"/>
-            <w:tcMar>
-              <w:top w:w="80" w:type="dxa"/>
-              <w:start w:w="120" w:type="dxa"/>
-              <w:bottom w:w="80" w:type="dxa"/>
-              <w:end w:w="120" w:type="dxa"/>
-            </w:tcMar>
-          </w:tcPr>
-          <w:p>
-            <w:r>
-              <w:rPr>
-                <w:sz w:val="18"/>
-              </w:rPr>
-              <w:t>36</w:t>
-            </w:r>
-          </w:p>
-        </w:tc>
-      </w:tr>
-      <w:tr>
-        <w:tc>
-          <w:tcPr>
-            <w:tcW w:type="dxa" w:w="4680"/>
-            <w:shd w:fill="E8EEF5"/>
-            <w:tcMar>
-              <w:top w:w="80" w:type="dxa"/>
-              <w:start w:w="120" w:type="dxa"/>
-              <w:bottom w:w="80" w:type="dxa"/>
-              <w:end w:w="120" w:type="dxa"/>
-            </w:tcMar>
-          </w:tcPr>
-          <w:p>
-            <w:r>
-              <w:rPr>
-                <w:sz w:val="18"/>
-              </w:rPr>
-              <w:t>Companies with email</w:t>
-            </w:r>
-          </w:p>
-        </w:tc>
-        <w:tc>
-          <w:tcPr>
-            <w:tcW w:type="dxa" w:w="4680"/>
-            <w:tcMar>
-              <w:top w:w="80" w:type="dxa"/>
-              <w:start w:w="120" w:type="dxa"/>
-              <w:bottom w:w="80" w:type="dxa"/>
-              <w:end w:w="120" w:type="dxa"/>
-            </w:tcMar>
-          </w:tcPr>
-          <w:p>
-            <w:r>
-              <w:rPr>
-                <w:sz w:val="18"/>
-              </w:rPr>
-              <w:t>17</w:t>
-            </w:r>
-          </w:p>
-        </w:tc>
-      </w:tr>
-      <w:tr>
-        <w:tc>
-          <w:tcPr>
-            <w:tcW w:type="dxa" w:w="4680"/>
-            <w:shd w:fill="E8EEF5"/>
-            <w:tcMar>
-              <w:top w:w="80" w:type="dxa"/>
-              <w:start w:w="120" w:type="dxa"/>
-              <w:bottom w:w="80" w:type="dxa"/>
-              <w:end w:w="120" w:type="dxa"/>
-            </w:tcMar>
-          </w:tcPr>
-          <w:p>
-            <w:r>
-              <w:rPr>
-                <w:sz w:val="18"/>
-              </w:rPr>
-              <w:t>Email addresses</w:t>
-            </w:r>
-          </w:p>
-        </w:tc>
-        <w:tc>
-          <w:tcPr>
-            <w:tcW w:type="dxa" w:w="4680"/>
-            <w:tcMar>
-              <w:top w:w="80" w:type="dxa"/>
-              <w:start w:w="120" w:type="dxa"/>
-              <w:bottom w:w="80" w:type="dxa"/>
-              <w:end w:w="120" w:type="dxa"/>
-            </w:tcMar>
-          </w:tcPr>
-          <w:p>
-            <w:r>
-              <w:rPr>
-                <w:sz w:val="18"/>
-              </w:rPr>
-              <w:t>21</w:t>
-            </w:r>
-          </w:p>
-        </w:tc>
-      </w:tr>
-      <w:tr>
-        <w:tc>
-          <w:tcPr>
-            <w:tcW w:type="dxa" w:w="4680"/>
-            <w:shd w:fill="E8EEF5"/>
-            <w:tcMar>
-              <w:top w:w="80" w:type="dxa"/>
-              <w:start w:w="120" w:type="dxa"/>
-              <w:bottom w:w="80" w:type="dxa"/>
-              <w:end w:w="120" w:type="dxa"/>
-            </w:tcMar>
-          </w:tcPr>
-          <w:p>
-            <w:r>
-              <w:rPr>
-                <w:sz w:val="18"/>
-              </w:rPr>
-              <w:t>Source</w:t>
-            </w:r>
-          </w:p>
-        </w:tc>
-        <w:tc>
-          <w:tcPr>
-            <w:tcW w:type="dxa" w:w="4680"/>
-            <w:tcMar>
-              <w:top w:w="80" w:type="dxa"/>
-              <w:start w:w="120" w:type="dxa"/>
-              <w:bottom w:w="80" w:type="dxa"/>
-              <w:end w:w="120" w:type="dxa"/>
-            </w:tcMar>
-          </w:tcPr>
-          <w:p>
-            <w:r>
-              <w:rPr>
-                <w:sz w:val="18"/>
-              </w:rPr>
-              <w:t>app/src/main/res/raw/companies.json</w:t>
-            </w:r>
-          </w:p>
-        </w:tc>
-      </w:tr>
-    </w:tbl>
     <w:p>
-      <w:pPr>
-        <w:pStyle w:val="Heading1"/>
-      </w:pPr>
       <w:r>
-        <w:t>Email List</w:t>
+        <w:t>sales@soyl.be</w:t>
       </w:r>
     </w:p>
-    <w:tbl>
-      <w:tblPr>
-        <w:tblW w:type="auto" w:w="0"/>
-        <w:jc w:val="left"/>
-        <w:tblLayout w:type="fixed"/>
-        <w:tblLook w:firstColumn="1" w:firstRow="1" w:lastColumn="0" w:lastRow="0" w:noHBand="0" w:noVBand="1" w:val="04A0"/>
-        <w:tblBorders>
-          <w:top w:val="single" w:sz="4" w:space="0" w:color="D9E1EA"/>
-          <w:left w:val="single" w:sz="4" w:space="0" w:color="D9E1EA"/>
-          <w:bottom w:val="single" w:sz="4" w:space="0" w:color="D9E1EA"/>
-          <w:right w:val="single" w:sz="4" w:space="0" w:color="D9E1EA"/>
-          <w:insideH w:val="single" w:sz="4" w:space="0" w:color="D9E1EA"/>
-          <w:insideV w:val="single" w:sz="4" w:space="0" w:color="D9E1EA"/>
-        </w:tblBorders>
-      </w:tblPr>
-      <w:tblGrid>
-        <w:gridCol w:w="1560"/>
-        <w:gridCol w:w="1560"/>
-        <w:gridCol w:w="1560"/>
-        <w:gridCol w:w="1560"/>
-        <w:gridCol w:w="1560"/>
-        <w:gridCol w:w="1560"/>
-      </w:tblGrid>
-      <w:tr>
-        <w:tc>
-          <w:tcPr>
-            <w:tcW w:type="dxa" w:w="2520"/>
-            <w:tcMar>
-              <w:top w:w="80" w:type="dxa"/>
-              <w:start w:w="120" w:type="dxa"/>
-              <w:bottom w:w="80" w:type="dxa"/>
-              <w:end w:w="120" w:type="dxa"/>
-            </w:tcMar>
-            <w:vAlign w:val="center"/>
-            <w:shd w:fill="E8EEF5"/>
-          </w:tcPr>
-          <w:p>
-            <w:pPr>
-              <w:jc w:val="center"/>
-            </w:pPr>
-            <w:r>
-              <w:rPr>
-                <w:b/>
-                <w:sz w:val="16"/>
-              </w:rPr>
-              <w:t>Email</w:t>
-            </w:r>
-          </w:p>
-        </w:tc>
-        <w:tc>
-          <w:tcPr>
-            <w:tcW w:type="dxa" w:w="2376"/>
-            <w:tcMar>
-              <w:top w:w="80" w:type="dxa"/>
-              <w:start w:w="120" w:type="dxa"/>
-              <w:bottom w:w="80" w:type="dxa"/>
-              <w:end w:w="120" w:type="dxa"/>
-            </w:tcMar>
-            <w:vAlign w:val="center"/>
-            <w:shd w:fill="E8EEF5"/>
-          </w:tcPr>
-          <w:p>
-            <w:pPr>
-              <w:jc w:val="center"/>
-            </w:pPr>
-            <w:r>
-              <w:rPr>
-                <w:b/>
-                <w:sz w:val="16"/>
-              </w:rPr>
-              <w:t>Company</w:t>
-            </w:r>
-          </w:p>
-        </w:tc>
-        <w:tc>
-          <w:tcPr>
-            <w:tcW w:type="dxa" w:w="1296"/>
-            <w:tcMar>
-              <w:top w:w="80" w:type="dxa"/>
-              <w:start w:w="120" w:type="dxa"/>
-              <w:bottom w:w="80" w:type="dxa"/>
-              <w:end w:w="120" w:type="dxa"/>
-            </w:tcMar>
-            <w:vAlign w:val="center"/>
-            <w:shd w:fill="E8EEF5"/>
-          </w:tcPr>
-          <w:p>
-            <w:pPr>
-              <w:jc w:val="center"/>
-            </w:pPr>
-            <w:r>
-              <w:rPr>
-                <w:b/>
-                <w:sz w:val="16"/>
-              </w:rPr>
-              <w:t>Country</w:t>
-            </w:r>
-          </w:p>
-        </w:tc>
-        <w:tc>
-          <w:tcPr>
-            <w:tcW w:type="dxa" w:w="1512"/>
-            <w:tcMar>
-              <w:top w:w="80" w:type="dxa"/>
-              <w:start w:w="120" w:type="dxa"/>
-              <w:bottom w:w="80" w:type="dxa"/>
-              <w:end w:w="120" w:type="dxa"/>
-            </w:tcMar>
-            <w:vAlign w:val="center"/>
-            <w:shd w:fill="E8EEF5"/>
-          </w:tcPr>
-          <w:p>
-            <w:pPr>
-              <w:jc w:val="center"/>
-            </w:pPr>
-            <w:r>
-              <w:rPr>
-                <w:b/>
-                <w:sz w:val="16"/>
-              </w:rPr>
-              <w:t>Contact point</w:t>
-            </w:r>
-          </w:p>
-        </w:tc>
-        <w:tc>
-          <w:tcPr>
-            <w:tcW w:type="dxa" w:w="1152"/>
-            <w:tcMar>
-              <w:top w:w="80" w:type="dxa"/>
-              <w:start w:w="120" w:type="dxa"/>
-              <w:bottom w:w="80" w:type="dxa"/>
-              <w:end w:w="120" w:type="dxa"/>
-            </w:tcMar>
-            <w:vAlign w:val="center"/>
-            <w:shd w:fill="E8EEF5"/>
-          </w:tcPr>
-          <w:p>
-            <w:pPr>
-              <w:jc w:val="center"/>
-            </w:pPr>
-            <w:r>
-              <w:rPr>
-                <w:b/>
-                <w:sz w:val="16"/>
-              </w:rPr>
-              <w:t>Status</w:t>
-            </w:r>
-          </w:p>
-        </w:tc>
-        <w:tc>
-          <w:tcPr>
-            <w:tcW w:type="dxa" w:w="504"/>
-            <w:tcMar>
-              <w:top w:w="80" w:type="dxa"/>
-              <w:start w:w="120" w:type="dxa"/>
-              <w:bottom w:w="80" w:type="dxa"/>
-              <w:end w:w="120" w:type="dxa"/>
-            </w:tcMar>
-            <w:vAlign w:val="center"/>
-            <w:shd w:fill="E8EEF5"/>
-          </w:tcPr>
-          <w:p>
-            <w:pPr>
-              <w:jc w:val="center"/>
-            </w:pPr>
-            <w:r>
-              <w:rPr>
-                <w:b/>
-                <w:sz w:val="16"/>
-              </w:rPr>
-              <w:t>ID</w:t>
-            </w:r>
-          </w:p>
-        </w:tc>
-      </w:tr>
-      <w:tr>
-        <w:tc>
-          <w:tcPr>
-            <w:tcW w:type="dxa" w:w="1560"/>
-            <w:tcMar>
-              <w:top w:w="70" w:type="dxa"/>
-              <w:start w:w="120" w:type="dxa"/>
-              <w:bottom w:w="70" w:type="dxa"/>
-              <w:end w:w="120" w:type="dxa"/>
-            </w:tcMar>
-          </w:tcPr>
-          <w:p>
-            <w:pPr>
-              <w:spacing w:after="0"/>
-            </w:pPr>
-            <w:r>
-              <w:rPr>
-                <w:sz w:val="14"/>
-              </w:rPr>
-              <w:t>orders@maraglobalfoods.com.au</w:t>
-            </w:r>
-          </w:p>
-        </w:tc>
-        <w:tc>
-          <w:tcPr>
-            <w:tcW w:type="dxa" w:w="1560"/>
-            <w:tcMar>
-              <w:top w:w="70" w:type="dxa"/>
-              <w:start w:w="120" w:type="dxa"/>
-              <w:bottom w:w="70" w:type="dxa"/>
-              <w:end w:w="120" w:type="dxa"/>
-            </w:tcMar>
-          </w:tcPr>
-          <w:p>
-            <w:pPr>
-              <w:spacing w:after="0"/>
-            </w:pPr>
-            <w:r>
-              <w:rPr>
-                <w:sz w:val="14"/>
-              </w:rPr>
-              <w:t>Mara Global Foods</w:t>
-            </w:r>
-          </w:p>
-        </w:tc>
-        <w:tc>
-          <w:tcPr>
-            <w:tcW w:type="dxa" w:w="1560"/>
-            <w:tcMar>
-              <w:top w:w="70" w:type="dxa"/>
-              <w:start w:w="120" w:type="dxa"/>
-              <w:bottom w:w="70" w:type="dxa"/>
-              <w:end w:w="120" w:type="dxa"/>
-            </w:tcMar>
-          </w:tcPr>
-          <w:p>
-            <w:pPr>
-              <w:spacing w:after="0"/>
-            </w:pPr>
-            <w:r>
-              <w:rPr>
-                <w:sz w:val="14"/>
-              </w:rPr>
-              <w:t>Australia</w:t>
-            </w:r>
-          </w:p>
-        </w:tc>
-        <w:tc>
-          <w:tcPr>
-            <w:tcW w:type="dxa" w:w="1560"/>
-            <w:tcMar>
-              <w:top w:w="70" w:type="dxa"/>
-              <w:start w:w="120" w:type="dxa"/>
-              <w:bottom w:w="70" w:type="dxa"/>
-              <w:end w:w="120" w:type="dxa"/>
-            </w:tcMar>
-          </w:tcPr>
-          <w:p>
-            <w:pPr>
-              <w:spacing w:after="0"/>
-            </w:pPr>
-            <w:r>
-              <w:rPr>
-                <w:sz w:val="14"/>
-              </w:rPr>
-              <w:t>Purchasing Manager / Sales and Supply Manager / Protein Meals Commercial Manager</w:t>
-            </w:r>
-          </w:p>
-        </w:tc>
-        <w:tc>
-          <w:tcPr>
-            <w:tcW w:type="dxa" w:w="1560"/>
-            <w:tcMar>
-              <w:top w:w="70" w:type="dxa"/>
-              <w:start w:w="120" w:type="dxa"/>
-              <w:bottom w:w="70" w:type="dxa"/>
-              <w:end w:w="120" w:type="dxa"/>
-            </w:tcMar>
-          </w:tcPr>
-          <w:p>
-            <w:pPr>
-              <w:spacing w:after="0"/>
-            </w:pPr>
-            <w:r>
-              <w:rPr>
-                <w:sz w:val="14"/>
-              </w:rPr>
-              <w:t>verified</w:t>
-            </w:r>
-          </w:p>
-        </w:tc>
-        <w:tc>
-          <w:tcPr>
-            <w:tcW w:type="dxa" w:w="1560"/>
-            <w:tcMar>
-              <w:top w:w="70" w:type="dxa"/>
-              <w:start w:w="120" w:type="dxa"/>
-              <w:bottom w:w="70" w:type="dxa"/>
-              <w:end w:w="120" w:type="dxa"/>
-            </w:tcMar>
-          </w:tcPr>
-          <w:p>
-            <w:pPr>
-              <w:spacing w:after="0"/>
-            </w:pPr>
-            <w:r>
-              <w:rPr>
-                <w:sz w:val="14"/>
-              </w:rPr>
-              <w:t>GOS-009</w:t>
-            </w:r>
-          </w:p>
-        </w:tc>
-      </w:tr>
-      <w:tr>
-        <w:tc>
-          <w:tcPr>
-            <w:tcW w:type="dxa" w:w="1560"/>
-            <w:tcMar>
-              <w:top w:w="70" w:type="dxa"/>
-              <w:start w:w="120" w:type="dxa"/>
-              <w:bottom w:w="70" w:type="dxa"/>
-              <w:end w:w="120" w:type="dxa"/>
-            </w:tcMar>
-          </w:tcPr>
-          <w:p>
-            <w:pPr>
-              <w:spacing w:after="0"/>
-            </w:pPr>
-            <w:r>
-              <w:rPr>
-                <w:sz w:val="14"/>
-              </w:rPr>
-              <w:t>sales@hyfeed.com.au</w:t>
-            </w:r>
-          </w:p>
-        </w:tc>
-        <w:tc>
-          <w:tcPr>
-            <w:tcW w:type="dxa" w:w="1560"/>
-            <w:tcMar>
-              <w:top w:w="70" w:type="dxa"/>
-              <w:start w:w="120" w:type="dxa"/>
-              <w:bottom w:w="70" w:type="dxa"/>
-              <w:end w:w="120" w:type="dxa"/>
-            </w:tcMar>
-          </w:tcPr>
-          <w:p>
-            <w:pPr>
-              <w:spacing w:after="0"/>
-            </w:pPr>
-            <w:r>
-              <w:rPr>
-                <w:sz w:val="14"/>
-              </w:rPr>
-              <w:t>PBA Feeds / Hyfeed</w:t>
-            </w:r>
-          </w:p>
-        </w:tc>
-        <w:tc>
-          <w:tcPr>
-            <w:tcW w:type="dxa" w:w="1560"/>
-            <w:tcMar>
-              <w:top w:w="70" w:type="dxa"/>
-              <w:start w:w="120" w:type="dxa"/>
-              <w:bottom w:w="70" w:type="dxa"/>
-              <w:end w:w="120" w:type="dxa"/>
-            </w:tcMar>
-          </w:tcPr>
-          <w:p>
-            <w:pPr>
-              <w:spacing w:after="0"/>
-            </w:pPr>
-            <w:r>
-              <w:rPr>
-                <w:sz w:val="14"/>
-              </w:rPr>
-              <w:t>Australia</w:t>
-            </w:r>
-          </w:p>
-        </w:tc>
-        <w:tc>
-          <w:tcPr>
-            <w:tcW w:type="dxa" w:w="1560"/>
-            <w:tcMar>
-              <w:top w:w="70" w:type="dxa"/>
-              <w:start w:w="120" w:type="dxa"/>
-              <w:bottom w:w="70" w:type="dxa"/>
-              <w:end w:w="120" w:type="dxa"/>
-            </w:tcMar>
-          </w:tcPr>
-          <w:p>
-            <w:pPr>
-              <w:spacing w:after="0"/>
-            </w:pPr>
-            <w:r>
-              <w:rPr>
-                <w:sz w:val="14"/>
-              </w:rPr>
-              <w:t>Purchasing Manager / Mill Manager / Feed Ingredients Buyer</w:t>
-            </w:r>
-          </w:p>
-        </w:tc>
-        <w:tc>
-          <w:tcPr>
-            <w:tcW w:type="dxa" w:w="1560"/>
-            <w:tcMar>
-              <w:top w:w="70" w:type="dxa"/>
-              <w:start w:w="120" w:type="dxa"/>
-              <w:bottom w:w="70" w:type="dxa"/>
-              <w:end w:w="120" w:type="dxa"/>
-            </w:tcMar>
-          </w:tcPr>
-          <w:p>
-            <w:pPr>
-              <w:spacing w:after="0"/>
-            </w:pPr>
-            <w:r>
-              <w:rPr>
-                <w:sz w:val="14"/>
-              </w:rPr>
-              <w:t>verified</w:t>
-            </w:r>
-          </w:p>
-        </w:tc>
-        <w:tc>
-          <w:tcPr>
-            <w:tcW w:type="dxa" w:w="1560"/>
-            <w:tcMar>
-              <w:top w:w="70" w:type="dxa"/>
-              <w:start w:w="120" w:type="dxa"/>
-              <w:bottom w:w="70" w:type="dxa"/>
-              <w:end w:w="120" w:type="dxa"/>
-            </w:tcMar>
-          </w:tcPr>
-          <w:p>
-            <w:pPr>
-              <w:spacing w:after="0"/>
-            </w:pPr>
-            <w:r>
-              <w:rPr>
-                <w:sz w:val="14"/>
-              </w:rPr>
-              <w:t>GOS-010</w:t>
-            </w:r>
-          </w:p>
-        </w:tc>
-      </w:tr>
-      <w:tr>
-        <w:tc>
-          <w:tcPr>
-            <w:tcW w:type="dxa" w:w="1560"/>
-            <w:tcMar>
-              <w:top w:w="70" w:type="dxa"/>
-              <w:start w:w="120" w:type="dxa"/>
-              <w:bottom w:w="70" w:type="dxa"/>
-              <w:end w:w="120" w:type="dxa"/>
-            </w:tcMar>
-          </w:tcPr>
-          <w:p>
-            <w:pPr>
-              <w:spacing w:after="0"/>
-            </w:pPr>
-            <w:r>
-              <w:rPr>
-                <w:sz w:val="14"/>
-              </w:rPr>
-              <w:t>sales@soyl.be</w:t>
-            </w:r>
-          </w:p>
-        </w:tc>
-        <w:tc>
-          <w:tcPr>
-            <w:tcW w:type="dxa" w:w="1560"/>
-            <w:tcMar>
-              <w:top w:w="70" w:type="dxa"/>
-              <w:start w:w="120" w:type="dxa"/>
-              <w:bottom w:w="70" w:type="dxa"/>
-              <w:end w:w="120" w:type="dxa"/>
-            </w:tcMar>
-          </w:tcPr>
-          <w:p>
-            <w:pPr>
-              <w:spacing w:after="0"/>
-            </w:pPr>
-            <w:r>
-              <w:rPr>
-                <w:sz w:val="14"/>
-              </w:rPr>
-              <w:t>Soyl NV</w:t>
-            </w:r>
-          </w:p>
-        </w:tc>
-        <w:tc>
-          <w:tcPr>
-            <w:tcW w:type="dxa" w:w="1560"/>
-            <w:tcMar>
-              <w:top w:w="70" w:type="dxa"/>
-              <w:start w:w="120" w:type="dxa"/>
-              <w:bottom w:w="70" w:type="dxa"/>
-              <w:end w:w="120" w:type="dxa"/>
-            </w:tcMar>
-          </w:tcPr>
-          <w:p>
-            <w:pPr>
-              <w:spacing w:after="0"/>
-            </w:pPr>
-            <w:r>
-              <w:rPr>
-                <w:sz w:val="14"/>
-              </w:rPr>
-              <w:t>Belgium</w:t>
-            </w:r>
-          </w:p>
-        </w:tc>
-        <w:tc>
-          <w:tcPr>
-            <w:tcW w:type="dxa" w:w="1560"/>
-            <w:tcMar>
-              <w:top w:w="70" w:type="dxa"/>
-              <w:start w:w="120" w:type="dxa"/>
-              <w:bottom w:w="70" w:type="dxa"/>
-              <w:end w:w="120" w:type="dxa"/>
-            </w:tcMar>
-          </w:tcPr>
-          <w:p>
-            <w:pPr>
-              <w:spacing w:after="0"/>
-            </w:pPr>
-            <w:r>
-              <w:rPr>
-                <w:sz w:val="14"/>
-              </w:rPr>
-              <w:t>Purchasing Manager / Sales Manager Organic Soy / Raw Materials Buyer</w:t>
-            </w:r>
-          </w:p>
-        </w:tc>
-        <w:tc>
-          <w:tcPr>
-            <w:tcW w:type="dxa" w:w="1560"/>
-            <w:tcMar>
-              <w:top w:w="70" w:type="dxa"/>
-              <w:start w:w="120" w:type="dxa"/>
-              <w:bottom w:w="70" w:type="dxa"/>
-              <w:end w:w="120" w:type="dxa"/>
-            </w:tcMar>
-          </w:tcPr>
-          <w:p>
-            <w:pPr>
-              <w:spacing w:after="0"/>
-            </w:pPr>
-            <w:r>
-              <w:rPr>
-                <w:sz w:val="14"/>
-              </w:rPr>
-              <w:t>verified</w:t>
-            </w:r>
-          </w:p>
-        </w:tc>
-        <w:tc>
-          <w:tcPr>
-            <w:tcW w:type="dxa" w:w="1560"/>
-            <w:tcMar>
-              <w:top w:w="70" w:type="dxa"/>
-              <w:start w:w="120" w:type="dxa"/>
-              <w:bottom w:w="70" w:type="dxa"/>
-              <w:end w:w="120" w:type="dxa"/>
-            </w:tcMar>
-          </w:tcPr>
-          <w:p>
-            <w:pPr>
-              <w:spacing w:after="0"/>
-            </w:pPr>
-            <w:r>
-              <w:rPr>
-                <w:sz w:val="14"/>
-              </w:rPr>
-              <w:t>GOS-011</w:t>
-            </w:r>
-          </w:p>
-        </w:tc>
-      </w:tr>
-      <w:tr>
-        <w:tc>
-          <w:tcPr>
-            <w:tcW w:type="dxa" w:w="1560"/>
-            <w:tcMar>
-              <w:top w:w="70" w:type="dxa"/>
-              <w:start w:w="120" w:type="dxa"/>
-              <w:bottom w:w="70" w:type="dxa"/>
-              <w:end w:w="120" w:type="dxa"/>
-            </w:tcMar>
-          </w:tcPr>
-          <w:p>
-            <w:pPr>
-              <w:spacing w:after="0"/>
-            </w:pPr>
-            <w:r>
-              <w:rPr>
-                <w:sz w:val="14"/>
-              </w:rPr>
-              <w:t>oelmuehle@vfi-oilsforlife.com</w:t>
-            </w:r>
-          </w:p>
-        </w:tc>
-        <w:tc>
-          <w:tcPr>
-            <w:tcW w:type="dxa" w:w="1560"/>
-            <w:tcMar>
-              <w:top w:w="70" w:type="dxa"/>
-              <w:start w:w="120" w:type="dxa"/>
-              <w:bottom w:w="70" w:type="dxa"/>
-              <w:end w:w="120" w:type="dxa"/>
-            </w:tcMar>
-          </w:tcPr>
-          <w:p>
-            <w:pPr>
-              <w:spacing w:after="0"/>
-            </w:pPr>
-            <w:r>
-              <w:rPr>
-                <w:sz w:val="14"/>
-              </w:rPr>
-              <w:t>VFI GmbH - Olmuhle Ennsdorf</w:t>
-            </w:r>
-          </w:p>
-        </w:tc>
-        <w:tc>
-          <w:tcPr>
-            <w:tcW w:type="dxa" w:w="1560"/>
-            <w:tcMar>
-              <w:top w:w="70" w:type="dxa"/>
-              <w:start w:w="120" w:type="dxa"/>
-              <w:bottom w:w="70" w:type="dxa"/>
-              <w:end w:w="120" w:type="dxa"/>
-            </w:tcMar>
-          </w:tcPr>
-          <w:p>
-            <w:pPr>
-              <w:spacing w:after="0"/>
-            </w:pPr>
-            <w:r>
-              <w:rPr>
-                <w:sz w:val="14"/>
-              </w:rPr>
-              <w:t>Austria</w:t>
-            </w:r>
-          </w:p>
-        </w:tc>
-        <w:tc>
-          <w:tcPr>
-            <w:tcW w:type="dxa" w:w="1560"/>
-            <w:tcMar>
-              <w:top w:w="70" w:type="dxa"/>
-              <w:start w:w="120" w:type="dxa"/>
-              <w:bottom w:w="70" w:type="dxa"/>
-              <w:end w:w="120" w:type="dxa"/>
-            </w:tcMar>
-          </w:tcPr>
-          <w:p>
-            <w:pPr>
-              <w:spacing w:after="0"/>
-            </w:pPr>
-            <w:r>
-              <w:rPr>
-                <w:sz w:val="14"/>
-              </w:rPr>
-              <w:t>Feedstuff Sales / Raw Materials Procurement / Oil Mill Operations Manager</w:t>
-            </w:r>
-          </w:p>
-        </w:tc>
-        <w:tc>
-          <w:tcPr>
-            <w:tcW w:type="dxa" w:w="1560"/>
-            <w:tcMar>
-              <w:top w:w="70" w:type="dxa"/>
-              <w:start w:w="120" w:type="dxa"/>
-              <w:bottom w:w="70" w:type="dxa"/>
-              <w:end w:w="120" w:type="dxa"/>
-            </w:tcMar>
-          </w:tcPr>
-          <w:p>
-            <w:pPr>
-              <w:spacing w:after="0"/>
-            </w:pPr>
-            <w:r>
-              <w:rPr>
-                <w:sz w:val="14"/>
-              </w:rPr>
-              <w:t>verified</w:t>
-            </w:r>
-          </w:p>
-        </w:tc>
-        <w:tc>
-          <w:tcPr>
-            <w:tcW w:type="dxa" w:w="1560"/>
-            <w:tcMar>
-              <w:top w:w="70" w:type="dxa"/>
-              <w:start w:w="120" w:type="dxa"/>
-              <w:bottom w:w="70" w:type="dxa"/>
-              <w:end w:w="120" w:type="dxa"/>
-            </w:tcMar>
-          </w:tcPr>
-          <w:p>
-            <w:pPr>
-              <w:spacing w:after="0"/>
-            </w:pPr>
-            <w:r>
-              <w:rPr>
-                <w:sz w:val="14"/>
-              </w:rPr>
-              <w:t>GOS-012</w:t>
-            </w:r>
-          </w:p>
-        </w:tc>
-      </w:tr>
-      <w:tr>
-        <w:tc>
-          <w:tcPr>
-            <w:tcW w:type="dxa" w:w="1560"/>
-            <w:tcMar>
-              <w:top w:w="70" w:type="dxa"/>
-              <w:start w:w="120" w:type="dxa"/>
-              <w:bottom w:w="70" w:type="dxa"/>
-              <w:end w:w="120" w:type="dxa"/>
-            </w:tcMar>
-          </w:tcPr>
-          <w:p>
-            <w:pPr>
-              <w:spacing w:after="0"/>
-            </w:pPr>
-            <w:r>
-              <w:rPr>
-                <w:sz w:val="14"/>
-              </w:rPr>
-              <w:t>eric@simmonsgrain.com</w:t>
-            </w:r>
-          </w:p>
-        </w:tc>
-        <w:tc>
-          <w:tcPr>
-            <w:tcW w:type="dxa" w:w="1560"/>
-            <w:tcMar>
-              <w:top w:w="70" w:type="dxa"/>
-              <w:start w:w="120" w:type="dxa"/>
-              <w:bottom w:w="70" w:type="dxa"/>
-              <w:end w:w="120" w:type="dxa"/>
-            </w:tcMar>
-          </w:tcPr>
-          <w:p>
-            <w:pPr>
-              <w:spacing w:after="0"/>
-            </w:pPr>
-            <w:r>
-              <w:rPr>
-                <w:sz w:val="14"/>
-              </w:rPr>
-              <w:t>Simmons Grain Company</w:t>
-            </w:r>
-          </w:p>
-        </w:tc>
-        <w:tc>
-          <w:tcPr>
-            <w:tcW w:type="dxa" w:w="1560"/>
-            <w:tcMar>
-              <w:top w:w="70" w:type="dxa"/>
-              <w:start w:w="120" w:type="dxa"/>
-              <w:bottom w:w="70" w:type="dxa"/>
-              <w:end w:w="120" w:type="dxa"/>
-            </w:tcMar>
-          </w:tcPr>
-          <w:p>
-            <w:pPr>
-              <w:spacing w:after="0"/>
-            </w:pPr>
-            <w:r>
-              <w:rPr>
-                <w:sz w:val="14"/>
-              </w:rPr>
-              <w:t>United States</w:t>
-            </w:r>
-          </w:p>
-        </w:tc>
-        <w:tc>
-          <w:tcPr>
-            <w:tcW w:type="dxa" w:w="1560"/>
-            <w:tcMar>
-              <w:top w:w="70" w:type="dxa"/>
-              <w:start w:w="120" w:type="dxa"/>
-              <w:bottom w:w="70" w:type="dxa"/>
-              <w:end w:w="120" w:type="dxa"/>
-            </w:tcMar>
-          </w:tcPr>
-          <w:p>
-            <w:pPr>
-              <w:spacing w:after="0"/>
-            </w:pPr>
-            <w:r>
-              <w:rPr>
-                <w:sz w:val="14"/>
-              </w:rPr>
-              <w:t>Procurement Manager / Organic Soybean Buyer / Ingredient Sales Manager</w:t>
-            </w:r>
-          </w:p>
-        </w:tc>
-        <w:tc>
-          <w:tcPr>
-            <w:tcW w:type="dxa" w:w="1560"/>
-            <w:tcMar>
-              <w:top w:w="70" w:type="dxa"/>
-              <w:start w:w="120" w:type="dxa"/>
-              <w:bottom w:w="70" w:type="dxa"/>
-              <w:end w:w="120" w:type="dxa"/>
-            </w:tcMar>
-          </w:tcPr>
-          <w:p>
-            <w:pPr>
-              <w:spacing w:after="0"/>
-            </w:pPr>
-            <w:r>
-              <w:rPr>
-                <w:sz w:val="14"/>
-              </w:rPr>
-              <w:t>verified</w:t>
-            </w:r>
-          </w:p>
-        </w:tc>
-        <w:tc>
-          <w:tcPr>
-            <w:tcW w:type="dxa" w:w="1560"/>
-            <w:tcMar>
-              <w:top w:w="70" w:type="dxa"/>
-              <w:start w:w="120" w:type="dxa"/>
-              <w:bottom w:w="70" w:type="dxa"/>
-              <w:end w:w="120" w:type="dxa"/>
-            </w:tcMar>
-          </w:tcPr>
-          <w:p>
-            <w:pPr>
-              <w:spacing w:after="0"/>
-            </w:pPr>
-            <w:r>
-              <w:rPr>
-                <w:sz w:val="14"/>
-              </w:rPr>
-              <w:t>GOS-015</w:t>
-            </w:r>
-          </w:p>
-        </w:tc>
-      </w:tr>
-      <w:tr>
-        <w:tc>
-          <w:tcPr>
-            <w:tcW w:type="dxa" w:w="1560"/>
-            <w:tcMar>
-              <w:top w:w="70" w:type="dxa"/>
-              <w:start w:w="120" w:type="dxa"/>
-              <w:bottom w:w="70" w:type="dxa"/>
-              <w:end w:w="120" w:type="dxa"/>
-            </w:tcMar>
-          </w:tcPr>
-          <w:p>
-            <w:pPr>
-              <w:spacing w:after="0"/>
-            </w:pPr>
-            <w:r>
-              <w:rPr>
-                <w:sz w:val="14"/>
-              </w:rPr>
-              <w:t>annette@simmonsgrain.com</w:t>
-            </w:r>
-          </w:p>
-        </w:tc>
-        <w:tc>
-          <w:tcPr>
-            <w:tcW w:type="dxa" w:w="1560"/>
-            <w:tcMar>
-              <w:top w:w="70" w:type="dxa"/>
-              <w:start w:w="120" w:type="dxa"/>
-              <w:bottom w:w="70" w:type="dxa"/>
-              <w:end w:w="120" w:type="dxa"/>
-            </w:tcMar>
-          </w:tcPr>
-          <w:p>
-            <w:pPr>
-              <w:spacing w:after="0"/>
-            </w:pPr>
-            <w:r>
-              <w:rPr>
-                <w:sz w:val="14"/>
-              </w:rPr>
-              <w:t>Simmons Grain Company</w:t>
-            </w:r>
-          </w:p>
-        </w:tc>
-        <w:tc>
-          <w:tcPr>
-            <w:tcW w:type="dxa" w:w="1560"/>
-            <w:tcMar>
-              <w:top w:w="70" w:type="dxa"/>
-              <w:start w:w="120" w:type="dxa"/>
-              <w:bottom w:w="70" w:type="dxa"/>
-              <w:end w:w="120" w:type="dxa"/>
-            </w:tcMar>
-          </w:tcPr>
-          <w:p>
-            <w:pPr>
-              <w:spacing w:after="0"/>
-            </w:pPr>
-            <w:r>
-              <w:rPr>
-                <w:sz w:val="14"/>
-              </w:rPr>
-              <w:t>United States</w:t>
-            </w:r>
-          </w:p>
-        </w:tc>
-        <w:tc>
-          <w:tcPr>
-            <w:tcW w:type="dxa" w:w="1560"/>
-            <w:tcMar>
-              <w:top w:w="70" w:type="dxa"/>
-              <w:start w:w="120" w:type="dxa"/>
-              <w:bottom w:w="70" w:type="dxa"/>
-              <w:end w:w="120" w:type="dxa"/>
-            </w:tcMar>
-          </w:tcPr>
-          <w:p>
-            <w:pPr>
-              <w:spacing w:after="0"/>
-            </w:pPr>
-            <w:r>
-              <w:rPr>
-                <w:sz w:val="14"/>
-              </w:rPr>
-              <w:t>Procurement Manager / Organic Soybean Buyer / Ingredient Sales Manager</w:t>
-            </w:r>
-          </w:p>
-        </w:tc>
-        <w:tc>
-          <w:tcPr>
-            <w:tcW w:type="dxa" w:w="1560"/>
-            <w:tcMar>
-              <w:top w:w="70" w:type="dxa"/>
-              <w:start w:w="120" w:type="dxa"/>
-              <w:bottom w:w="70" w:type="dxa"/>
-              <w:end w:w="120" w:type="dxa"/>
-            </w:tcMar>
-          </w:tcPr>
-          <w:p>
-            <w:pPr>
-              <w:spacing w:after="0"/>
-            </w:pPr>
-            <w:r>
-              <w:rPr>
-                <w:sz w:val="14"/>
-              </w:rPr>
-              <w:t>verified</w:t>
-            </w:r>
-          </w:p>
-        </w:tc>
-        <w:tc>
-          <w:tcPr>
-            <w:tcW w:type="dxa" w:w="1560"/>
-            <w:tcMar>
-              <w:top w:w="70" w:type="dxa"/>
-              <w:start w:w="120" w:type="dxa"/>
-              <w:bottom w:w="70" w:type="dxa"/>
-              <w:end w:w="120" w:type="dxa"/>
-            </w:tcMar>
-          </w:tcPr>
-          <w:p>
-            <w:pPr>
-              <w:spacing w:after="0"/>
-            </w:pPr>
-            <w:r>
-              <w:rPr>
-                <w:sz w:val="14"/>
-              </w:rPr>
-              <w:t>GOS-015</w:t>
-            </w:r>
-          </w:p>
-        </w:tc>
-      </w:tr>
-      <w:tr>
-        <w:tc>
-          <w:tcPr>
-            <w:tcW w:type="dxa" w:w="1560"/>
-            <w:tcMar>
-              <w:top w:w="70" w:type="dxa"/>
-              <w:start w:w="120" w:type="dxa"/>
-              <w:bottom w:w="70" w:type="dxa"/>
-              <w:end w:w="120" w:type="dxa"/>
-            </w:tcMar>
-          </w:tcPr>
-          <w:p>
-            <w:pPr>
-              <w:spacing w:after="0"/>
-            </w:pPr>
-            <w:r>
-              <w:rPr>
-                <w:sz w:val="14"/>
-              </w:rPr>
-              <w:t>info@boydstation.com</w:t>
-            </w:r>
-          </w:p>
-        </w:tc>
-        <w:tc>
-          <w:tcPr>
-            <w:tcW w:type="dxa" w:w="1560"/>
-            <w:tcMar>
-              <w:top w:w="70" w:type="dxa"/>
-              <w:start w:w="120" w:type="dxa"/>
-              <w:bottom w:w="70" w:type="dxa"/>
-              <w:end w:w="120" w:type="dxa"/>
-            </w:tcMar>
-          </w:tcPr>
-          <w:p>
-            <w:pPr>
-              <w:spacing w:after="0"/>
-            </w:pPr>
-            <w:r>
-              <w:rPr>
-                <w:sz w:val="14"/>
-              </w:rPr>
-              <w:t>Boyd Station</w:t>
-            </w:r>
-          </w:p>
-        </w:tc>
-        <w:tc>
-          <w:tcPr>
-            <w:tcW w:type="dxa" w:w="1560"/>
-            <w:tcMar>
-              <w:top w:w="70" w:type="dxa"/>
-              <w:start w:w="120" w:type="dxa"/>
-              <w:bottom w:w="70" w:type="dxa"/>
-              <w:end w:w="120" w:type="dxa"/>
-            </w:tcMar>
-          </w:tcPr>
-          <w:p>
-            <w:pPr>
-              <w:spacing w:after="0"/>
-            </w:pPr>
-            <w:r>
-              <w:rPr>
-                <w:sz w:val="14"/>
-              </w:rPr>
-              <w:t>United States</w:t>
-            </w:r>
-          </w:p>
-        </w:tc>
-        <w:tc>
-          <w:tcPr>
-            <w:tcW w:type="dxa" w:w="1560"/>
-            <w:tcMar>
-              <w:top w:w="70" w:type="dxa"/>
-              <w:start w:w="120" w:type="dxa"/>
-              <w:bottom w:w="70" w:type="dxa"/>
-              <w:end w:w="120" w:type="dxa"/>
-            </w:tcMar>
-          </w:tcPr>
-          <w:p>
-            <w:pPr>
-              <w:spacing w:after="0"/>
-            </w:pPr>
-            <w:r>
-              <w:rPr>
-                <w:sz w:val="14"/>
-              </w:rPr>
-              <w:t>Procurement Manager / Ingredient Sales Manager / Supply Team</w:t>
-            </w:r>
-          </w:p>
-        </w:tc>
-        <w:tc>
-          <w:tcPr>
-            <w:tcW w:type="dxa" w:w="1560"/>
-            <w:tcMar>
-              <w:top w:w="70" w:type="dxa"/>
-              <w:start w:w="120" w:type="dxa"/>
-              <w:bottom w:w="70" w:type="dxa"/>
-              <w:end w:w="120" w:type="dxa"/>
-            </w:tcMar>
-          </w:tcPr>
-          <w:p>
-            <w:pPr>
-              <w:spacing w:after="0"/>
-            </w:pPr>
-            <w:r>
-              <w:rPr>
-                <w:sz w:val="14"/>
-              </w:rPr>
-              <w:t>verified</w:t>
-            </w:r>
-          </w:p>
-        </w:tc>
-        <w:tc>
-          <w:tcPr>
-            <w:tcW w:type="dxa" w:w="1560"/>
-            <w:tcMar>
-              <w:top w:w="70" w:type="dxa"/>
-              <w:start w:w="120" w:type="dxa"/>
-              <w:bottom w:w="70" w:type="dxa"/>
-              <w:end w:w="120" w:type="dxa"/>
-            </w:tcMar>
-          </w:tcPr>
-          <w:p>
-            <w:pPr>
-              <w:spacing w:after="0"/>
-            </w:pPr>
-            <w:r>
-              <w:rPr>
-                <w:sz w:val="14"/>
-              </w:rPr>
-              <w:t>GOS-017</w:t>
-            </w:r>
-          </w:p>
-        </w:tc>
-      </w:tr>
-      <w:tr>
-        <w:tc>
-          <w:tcPr>
-            <w:tcW w:type="dxa" w:w="1560"/>
-            <w:tcMar>
-              <w:top w:w="70" w:type="dxa"/>
-              <w:start w:w="120" w:type="dxa"/>
-              <w:bottom w:w="70" w:type="dxa"/>
-              <w:end w:w="120" w:type="dxa"/>
-            </w:tcMar>
-          </w:tcPr>
-          <w:p>
-            <w:pPr>
-              <w:spacing w:after="0"/>
-            </w:pPr>
-            <w:r>
-              <w:rPr>
-                <w:sz w:val="14"/>
-              </w:rPr>
-              <w:t>rford@boydstation.com</w:t>
-            </w:r>
-          </w:p>
-        </w:tc>
-        <w:tc>
-          <w:tcPr>
-            <w:tcW w:type="dxa" w:w="1560"/>
-            <w:tcMar>
-              <w:top w:w="70" w:type="dxa"/>
-              <w:start w:w="120" w:type="dxa"/>
-              <w:bottom w:w="70" w:type="dxa"/>
-              <w:end w:w="120" w:type="dxa"/>
-            </w:tcMar>
-          </w:tcPr>
-          <w:p>
-            <w:pPr>
-              <w:spacing w:after="0"/>
-            </w:pPr>
-            <w:r>
-              <w:rPr>
-                <w:sz w:val="14"/>
-              </w:rPr>
-              <w:t>Boyd Station</w:t>
-            </w:r>
-          </w:p>
-        </w:tc>
-        <w:tc>
-          <w:tcPr>
-            <w:tcW w:type="dxa" w:w="1560"/>
-            <w:tcMar>
-              <w:top w:w="70" w:type="dxa"/>
-              <w:start w:w="120" w:type="dxa"/>
-              <w:bottom w:w="70" w:type="dxa"/>
-              <w:end w:w="120" w:type="dxa"/>
-            </w:tcMar>
-          </w:tcPr>
-          <w:p>
-            <w:pPr>
-              <w:spacing w:after="0"/>
-            </w:pPr>
-            <w:r>
-              <w:rPr>
-                <w:sz w:val="14"/>
-              </w:rPr>
-              <w:t>United States</w:t>
-            </w:r>
-          </w:p>
-        </w:tc>
-        <w:tc>
-          <w:tcPr>
-            <w:tcW w:type="dxa" w:w="1560"/>
-            <w:tcMar>
-              <w:top w:w="70" w:type="dxa"/>
-              <w:start w:w="120" w:type="dxa"/>
-              <w:bottom w:w="70" w:type="dxa"/>
-              <w:end w:w="120" w:type="dxa"/>
-            </w:tcMar>
-          </w:tcPr>
-          <w:p>
-            <w:pPr>
-              <w:spacing w:after="0"/>
-            </w:pPr>
-            <w:r>
-              <w:rPr>
-                <w:sz w:val="14"/>
-              </w:rPr>
-              <w:t>Procurement Manager / Ingredient Sales Manager / Supply Team</w:t>
-            </w:r>
-          </w:p>
-        </w:tc>
-        <w:tc>
-          <w:tcPr>
-            <w:tcW w:type="dxa" w:w="1560"/>
-            <w:tcMar>
-              <w:top w:w="70" w:type="dxa"/>
-              <w:start w:w="120" w:type="dxa"/>
-              <w:bottom w:w="70" w:type="dxa"/>
-              <w:end w:w="120" w:type="dxa"/>
-            </w:tcMar>
-          </w:tcPr>
-          <w:p>
-            <w:pPr>
-              <w:spacing w:after="0"/>
-            </w:pPr>
-            <w:r>
-              <w:rPr>
-                <w:sz w:val="14"/>
-              </w:rPr>
-              <w:t>verified</w:t>
-            </w:r>
-          </w:p>
-        </w:tc>
-        <w:tc>
-          <w:tcPr>
-            <w:tcW w:type="dxa" w:w="1560"/>
-            <w:tcMar>
-              <w:top w:w="70" w:type="dxa"/>
-              <w:start w:w="120" w:type="dxa"/>
-              <w:bottom w:w="70" w:type="dxa"/>
-              <w:end w:w="120" w:type="dxa"/>
-            </w:tcMar>
-          </w:tcPr>
-          <w:p>
-            <w:pPr>
-              <w:spacing w:after="0"/>
-            </w:pPr>
-            <w:r>
-              <w:rPr>
-                <w:sz w:val="14"/>
-              </w:rPr>
-              <w:t>GOS-017</w:t>
-            </w:r>
-          </w:p>
-        </w:tc>
-      </w:tr>
-      <w:tr>
-        <w:tc>
-          <w:tcPr>
-            <w:tcW w:type="dxa" w:w="1560"/>
-            <w:tcMar>
-              <w:top w:w="70" w:type="dxa"/>
-              <w:start w:w="120" w:type="dxa"/>
-              <w:bottom w:w="70" w:type="dxa"/>
-              <w:end w:w="120" w:type="dxa"/>
-            </w:tcMar>
-          </w:tcPr>
-          <w:p>
-            <w:pPr>
-              <w:spacing w:after="0"/>
-            </w:pPr>
-            <w:r>
-              <w:rPr>
-                <w:sz w:val="14"/>
-              </w:rPr>
-              <w:t>info@caprockgrain.com</w:t>
-            </w:r>
-          </w:p>
-        </w:tc>
-        <w:tc>
-          <w:tcPr>
-            <w:tcW w:type="dxa" w:w="1560"/>
-            <w:tcMar>
-              <w:top w:w="70" w:type="dxa"/>
-              <w:start w:w="120" w:type="dxa"/>
-              <w:bottom w:w="70" w:type="dxa"/>
-              <w:end w:w="120" w:type="dxa"/>
-            </w:tcMar>
-          </w:tcPr>
-          <w:p>
-            <w:pPr>
-              <w:spacing w:after="0"/>
-            </w:pPr>
-            <w:r>
-              <w:rPr>
-                <w:sz w:val="14"/>
-              </w:rPr>
-              <w:t>CapRock Grain</w:t>
-            </w:r>
-          </w:p>
-        </w:tc>
-        <w:tc>
-          <w:tcPr>
-            <w:tcW w:type="dxa" w:w="1560"/>
-            <w:tcMar>
-              <w:top w:w="70" w:type="dxa"/>
-              <w:start w:w="120" w:type="dxa"/>
-              <w:bottom w:w="70" w:type="dxa"/>
-              <w:end w:w="120" w:type="dxa"/>
-            </w:tcMar>
-          </w:tcPr>
-          <w:p>
-            <w:pPr>
-              <w:spacing w:after="0"/>
-            </w:pPr>
-            <w:r>
-              <w:rPr>
-                <w:sz w:val="14"/>
-              </w:rPr>
-              <w:t>United States</w:t>
-            </w:r>
-          </w:p>
-        </w:tc>
-        <w:tc>
-          <w:tcPr>
-            <w:tcW w:type="dxa" w:w="1560"/>
-            <w:tcMar>
-              <w:top w:w="70" w:type="dxa"/>
-              <w:start w:w="120" w:type="dxa"/>
-              <w:bottom w:w="70" w:type="dxa"/>
-              <w:end w:w="120" w:type="dxa"/>
-            </w:tcMar>
-          </w:tcPr>
-          <w:p>
-            <w:pPr>
-              <w:spacing w:after="0"/>
-            </w:pPr>
-            <w:r>
-              <w:rPr>
-                <w:sz w:val="14"/>
-              </w:rPr>
-              <w:t>Organic Feed Ingredients Buyer / Procurement Manager / Trading Desk</w:t>
-            </w:r>
-          </w:p>
-        </w:tc>
-        <w:tc>
-          <w:tcPr>
-            <w:tcW w:type="dxa" w:w="1560"/>
-            <w:tcMar>
-              <w:top w:w="70" w:type="dxa"/>
-              <w:start w:w="120" w:type="dxa"/>
-              <w:bottom w:w="70" w:type="dxa"/>
-              <w:end w:w="120" w:type="dxa"/>
-            </w:tcMar>
-          </w:tcPr>
-          <w:p>
-            <w:pPr>
-              <w:spacing w:after="0"/>
-            </w:pPr>
-            <w:r>
-              <w:rPr>
-                <w:sz w:val="14"/>
-              </w:rPr>
-              <w:t>verified</w:t>
-            </w:r>
-          </w:p>
-        </w:tc>
-        <w:tc>
-          <w:tcPr>
-            <w:tcW w:type="dxa" w:w="1560"/>
-            <w:tcMar>
-              <w:top w:w="70" w:type="dxa"/>
-              <w:start w:w="120" w:type="dxa"/>
-              <w:bottom w:w="70" w:type="dxa"/>
-              <w:end w:w="120" w:type="dxa"/>
-            </w:tcMar>
-          </w:tcPr>
-          <w:p>
-            <w:pPr>
-              <w:spacing w:after="0"/>
-            </w:pPr>
-            <w:r>
-              <w:rPr>
-                <w:sz w:val="14"/>
-              </w:rPr>
-              <w:t>GOS-019</w:t>
-            </w:r>
-          </w:p>
-        </w:tc>
-      </w:tr>
-      <w:tr>
-        <w:tc>
-          <w:tcPr>
-            <w:tcW w:type="dxa" w:w="1560"/>
-            <w:tcMar>
-              <w:top w:w="70" w:type="dxa"/>
-              <w:start w:w="120" w:type="dxa"/>
-              <w:bottom w:w="70" w:type="dxa"/>
-              <w:end w:w="120" w:type="dxa"/>
-            </w:tcMar>
-          </w:tcPr>
-          <w:p>
-            <w:pPr>
-              <w:spacing w:after="0"/>
-            </w:pPr>
-            <w:r>
-              <w:rPr>
-                <w:sz w:val="14"/>
-              </w:rPr>
-              <w:t>tianwei@tianweibiotech.com</w:t>
-            </w:r>
-          </w:p>
-        </w:tc>
-        <w:tc>
-          <w:tcPr>
-            <w:tcW w:type="dxa" w:w="1560"/>
-            <w:tcMar>
-              <w:top w:w="70" w:type="dxa"/>
-              <w:start w:w="120" w:type="dxa"/>
-              <w:bottom w:w="70" w:type="dxa"/>
-              <w:end w:w="120" w:type="dxa"/>
-            </w:tcMar>
-          </w:tcPr>
-          <w:p>
-            <w:pPr>
-              <w:spacing w:after="0"/>
-            </w:pPr>
-            <w:r>
-              <w:rPr>
-                <w:sz w:val="14"/>
-              </w:rPr>
-              <w:t>Tianwei Group</w:t>
-            </w:r>
-          </w:p>
-        </w:tc>
-        <w:tc>
-          <w:tcPr>
-            <w:tcW w:type="dxa" w:w="1560"/>
-            <w:tcMar>
-              <w:top w:w="70" w:type="dxa"/>
-              <w:start w:w="120" w:type="dxa"/>
-              <w:bottom w:w="70" w:type="dxa"/>
-              <w:end w:w="120" w:type="dxa"/>
-            </w:tcMar>
-          </w:tcPr>
-          <w:p>
-            <w:pPr>
-              <w:spacing w:after="0"/>
-            </w:pPr>
-            <w:r>
-              <w:rPr>
-                <w:sz w:val="14"/>
-              </w:rPr>
-              <w:t>China</w:t>
-            </w:r>
-          </w:p>
-        </w:tc>
-        <w:tc>
-          <w:tcPr>
-            <w:tcW w:type="dxa" w:w="1560"/>
-            <w:tcMar>
-              <w:top w:w="70" w:type="dxa"/>
-              <w:start w:w="120" w:type="dxa"/>
-              <w:bottom w:w="70" w:type="dxa"/>
-              <w:end w:w="120" w:type="dxa"/>
-            </w:tcMar>
-          </w:tcPr>
-          <w:p>
-            <w:pPr>
-              <w:spacing w:after="0"/>
-            </w:pPr>
-            <w:r>
-              <w:rPr>
-                <w:sz w:val="14"/>
-              </w:rPr>
-              <w:t>Export Manager / Organic Soy Products Sales / Raw Materials Sales</w:t>
-            </w:r>
-          </w:p>
-        </w:tc>
-        <w:tc>
-          <w:tcPr>
-            <w:tcW w:type="dxa" w:w="1560"/>
-            <w:tcMar>
-              <w:top w:w="70" w:type="dxa"/>
-              <w:start w:w="120" w:type="dxa"/>
-              <w:bottom w:w="70" w:type="dxa"/>
-              <w:end w:w="120" w:type="dxa"/>
-            </w:tcMar>
-          </w:tcPr>
-          <w:p>
-            <w:pPr>
-              <w:spacing w:after="0"/>
-            </w:pPr>
-            <w:r>
-              <w:rPr>
-                <w:sz w:val="14"/>
-              </w:rPr>
-              <w:t>verified</w:t>
-            </w:r>
-          </w:p>
-        </w:tc>
-        <w:tc>
-          <w:tcPr>
-            <w:tcW w:type="dxa" w:w="1560"/>
-            <w:tcMar>
-              <w:top w:w="70" w:type="dxa"/>
-              <w:start w:w="120" w:type="dxa"/>
-              <w:bottom w:w="70" w:type="dxa"/>
-              <w:end w:w="120" w:type="dxa"/>
-            </w:tcMar>
-          </w:tcPr>
-          <w:p>
-            <w:pPr>
-              <w:spacing w:after="0"/>
-            </w:pPr>
-            <w:r>
-              <w:rPr>
-                <w:sz w:val="14"/>
-              </w:rPr>
-              <w:t>GOS-022</w:t>
-            </w:r>
-          </w:p>
-        </w:tc>
-      </w:tr>
-      <w:tr>
-        <w:tc>
-          <w:tcPr>
-            <w:tcW w:type="dxa" w:w="1560"/>
-            <w:tcMar>
-              <w:top w:w="70" w:type="dxa"/>
-              <w:start w:w="120" w:type="dxa"/>
-              <w:bottom w:w="70" w:type="dxa"/>
-              <w:end w:w="120" w:type="dxa"/>
-            </w:tcMar>
-          </w:tcPr>
-          <w:p>
-            <w:pPr>
-              <w:spacing w:after="0"/>
-            </w:pPr>
-            <w:r>
-              <w:rPr>
-                <w:sz w:val="14"/>
-              </w:rPr>
-              <w:t>export@tianweibiotech.com</w:t>
-            </w:r>
-          </w:p>
-        </w:tc>
-        <w:tc>
-          <w:tcPr>
-            <w:tcW w:type="dxa" w:w="1560"/>
-            <w:tcMar>
-              <w:top w:w="70" w:type="dxa"/>
-              <w:start w:w="120" w:type="dxa"/>
-              <w:bottom w:w="70" w:type="dxa"/>
-              <w:end w:w="120" w:type="dxa"/>
-            </w:tcMar>
-          </w:tcPr>
-          <w:p>
-            <w:pPr>
-              <w:spacing w:after="0"/>
-            </w:pPr>
-            <w:r>
-              <w:rPr>
-                <w:sz w:val="14"/>
-              </w:rPr>
-              <w:t>Tianwei Group</w:t>
-            </w:r>
-          </w:p>
-        </w:tc>
-        <w:tc>
-          <w:tcPr>
-            <w:tcW w:type="dxa" w:w="1560"/>
-            <w:tcMar>
-              <w:top w:w="70" w:type="dxa"/>
-              <w:start w:w="120" w:type="dxa"/>
-              <w:bottom w:w="70" w:type="dxa"/>
-              <w:end w:w="120" w:type="dxa"/>
-            </w:tcMar>
-          </w:tcPr>
-          <w:p>
-            <w:pPr>
-              <w:spacing w:after="0"/>
-            </w:pPr>
-            <w:r>
-              <w:rPr>
-                <w:sz w:val="14"/>
-              </w:rPr>
-              <w:t>China</w:t>
-            </w:r>
-          </w:p>
-        </w:tc>
-        <w:tc>
-          <w:tcPr>
-            <w:tcW w:type="dxa" w:w="1560"/>
-            <w:tcMar>
-              <w:top w:w="70" w:type="dxa"/>
-              <w:start w:w="120" w:type="dxa"/>
-              <w:bottom w:w="70" w:type="dxa"/>
-              <w:end w:w="120" w:type="dxa"/>
-            </w:tcMar>
-          </w:tcPr>
-          <w:p>
-            <w:pPr>
-              <w:spacing w:after="0"/>
-            </w:pPr>
-            <w:r>
-              <w:rPr>
-                <w:sz w:val="14"/>
-              </w:rPr>
-              <w:t>Export Manager / Organic Soy Products Sales / Raw Materials Sales</w:t>
-            </w:r>
-          </w:p>
-        </w:tc>
-        <w:tc>
-          <w:tcPr>
-            <w:tcW w:type="dxa" w:w="1560"/>
-            <w:tcMar>
-              <w:top w:w="70" w:type="dxa"/>
-              <w:start w:w="120" w:type="dxa"/>
-              <w:bottom w:w="70" w:type="dxa"/>
-              <w:end w:w="120" w:type="dxa"/>
-            </w:tcMar>
-          </w:tcPr>
-          <w:p>
-            <w:pPr>
-              <w:spacing w:after="0"/>
-            </w:pPr>
-            <w:r>
-              <w:rPr>
-                <w:sz w:val="14"/>
-              </w:rPr>
-              <w:t>verified</w:t>
-            </w:r>
-          </w:p>
-        </w:tc>
-        <w:tc>
-          <w:tcPr>
-            <w:tcW w:type="dxa" w:w="1560"/>
-            <w:tcMar>
-              <w:top w:w="70" w:type="dxa"/>
-              <w:start w:w="120" w:type="dxa"/>
-              <w:bottom w:w="70" w:type="dxa"/>
-              <w:end w:w="120" w:type="dxa"/>
-            </w:tcMar>
-          </w:tcPr>
-          <w:p>
-            <w:pPr>
-              <w:spacing w:after="0"/>
-            </w:pPr>
-            <w:r>
-              <w:rPr>
-                <w:sz w:val="14"/>
-              </w:rPr>
-              <w:t>GOS-022</w:t>
-            </w:r>
-          </w:p>
-        </w:tc>
-      </w:tr>
-      <w:tr>
-        <w:tc>
-          <w:tcPr>
-            <w:tcW w:type="dxa" w:w="1560"/>
-            <w:tcMar>
-              <w:top w:w="70" w:type="dxa"/>
-              <w:start w:w="120" w:type="dxa"/>
-              <w:bottom w:w="70" w:type="dxa"/>
-              <w:end w:w="120" w:type="dxa"/>
-            </w:tcMar>
-          </w:tcPr>
-          <w:p>
-            <w:pPr>
-              <w:spacing w:after="0"/>
-            </w:pPr>
-            <w:r>
-              <w:rPr>
-                <w:sz w:val="14"/>
-              </w:rPr>
-              <w:t>info@naturebiofoods.organic</w:t>
-            </w:r>
-          </w:p>
-        </w:tc>
-        <w:tc>
-          <w:tcPr>
-            <w:tcW w:type="dxa" w:w="1560"/>
-            <w:tcMar>
-              <w:top w:w="70" w:type="dxa"/>
-              <w:start w:w="120" w:type="dxa"/>
-              <w:bottom w:w="70" w:type="dxa"/>
-              <w:end w:w="120" w:type="dxa"/>
-            </w:tcMar>
-          </w:tcPr>
-          <w:p>
-            <w:pPr>
-              <w:spacing w:after="0"/>
-            </w:pPr>
-            <w:r>
-              <w:rPr>
-                <w:sz w:val="14"/>
-              </w:rPr>
-              <w:t>Nature Bio Foods</w:t>
-            </w:r>
-          </w:p>
-        </w:tc>
-        <w:tc>
-          <w:tcPr>
-            <w:tcW w:type="dxa" w:w="1560"/>
-            <w:tcMar>
-              <w:top w:w="70" w:type="dxa"/>
-              <w:start w:w="120" w:type="dxa"/>
-              <w:bottom w:w="70" w:type="dxa"/>
-              <w:end w:w="120" w:type="dxa"/>
-            </w:tcMar>
-          </w:tcPr>
-          <w:p>
-            <w:pPr>
-              <w:spacing w:after="0"/>
-            </w:pPr>
-            <w:r>
-              <w:rPr>
-                <w:sz w:val="14"/>
-              </w:rPr>
-              <w:t>India</w:t>
-            </w:r>
-          </w:p>
-        </w:tc>
-        <w:tc>
-          <w:tcPr>
-            <w:tcW w:type="dxa" w:w="1560"/>
-            <w:tcMar>
-              <w:top w:w="70" w:type="dxa"/>
-              <w:start w:w="120" w:type="dxa"/>
-              <w:bottom w:w="70" w:type="dxa"/>
-              <w:end w:w="120" w:type="dxa"/>
-            </w:tcMar>
-          </w:tcPr>
-          <w:p>
-            <w:pPr>
-              <w:spacing w:after="0"/>
-            </w:pPr>
-            <w:r>
-              <w:rPr>
-                <w:sz w:val="14"/>
-              </w:rPr>
-              <w:t>Export Sales Manager / Organic Soybean Meal Sales / Procurement Manager</w:t>
-            </w:r>
-          </w:p>
-        </w:tc>
-        <w:tc>
-          <w:tcPr>
-            <w:tcW w:type="dxa" w:w="1560"/>
-            <w:tcMar>
-              <w:top w:w="70" w:type="dxa"/>
-              <w:start w:w="120" w:type="dxa"/>
-              <w:bottom w:w="70" w:type="dxa"/>
-              <w:end w:w="120" w:type="dxa"/>
-            </w:tcMar>
-          </w:tcPr>
-          <w:p>
-            <w:pPr>
-              <w:spacing w:after="0"/>
-            </w:pPr>
-            <w:r>
-              <w:rPr>
-                <w:sz w:val="14"/>
-              </w:rPr>
-              <w:t>verified</w:t>
-            </w:r>
-          </w:p>
-        </w:tc>
-        <w:tc>
-          <w:tcPr>
-            <w:tcW w:type="dxa" w:w="1560"/>
-            <w:tcMar>
-              <w:top w:w="70" w:type="dxa"/>
-              <w:start w:w="120" w:type="dxa"/>
-              <w:bottom w:w="70" w:type="dxa"/>
-              <w:end w:w="120" w:type="dxa"/>
-            </w:tcMar>
-          </w:tcPr>
-          <w:p>
-            <w:pPr>
-              <w:spacing w:after="0"/>
-            </w:pPr>
-            <w:r>
-              <w:rPr>
-                <w:sz w:val="14"/>
-              </w:rPr>
-              <w:t>GOS-023</w:t>
-            </w:r>
-          </w:p>
-        </w:tc>
-      </w:tr>
-      <w:tr>
-        <w:tc>
-          <w:tcPr>
-            <w:tcW w:type="dxa" w:w="1560"/>
-            <w:tcMar>
-              <w:top w:w="70" w:type="dxa"/>
-              <w:start w:w="120" w:type="dxa"/>
-              <w:bottom w:w="70" w:type="dxa"/>
-              <w:end w:w="120" w:type="dxa"/>
-            </w:tcMar>
-          </w:tcPr>
-          <w:p>
-            <w:pPr>
-              <w:spacing w:after="0"/>
-            </w:pPr>
-            <w:r>
-              <w:rPr>
-                <w:sz w:val="14"/>
-              </w:rPr>
-              <w:t>helpdesk@anandagro.com</w:t>
-            </w:r>
-          </w:p>
-        </w:tc>
-        <w:tc>
-          <w:tcPr>
-            <w:tcW w:type="dxa" w:w="1560"/>
-            <w:tcMar>
-              <w:top w:w="70" w:type="dxa"/>
-              <w:start w:w="120" w:type="dxa"/>
-              <w:bottom w:w="70" w:type="dxa"/>
-              <w:end w:w="120" w:type="dxa"/>
-            </w:tcMar>
-          </w:tcPr>
-          <w:p>
-            <w:pPr>
-              <w:spacing w:after="0"/>
-            </w:pPr>
-            <w:r>
-              <w:rPr>
-                <w:sz w:val="14"/>
-              </w:rPr>
-              <w:t>Anand Agro</w:t>
-            </w:r>
-          </w:p>
-        </w:tc>
-        <w:tc>
-          <w:tcPr>
-            <w:tcW w:type="dxa" w:w="1560"/>
-            <w:tcMar>
-              <w:top w:w="70" w:type="dxa"/>
-              <w:start w:w="120" w:type="dxa"/>
-              <w:bottom w:w="70" w:type="dxa"/>
-              <w:end w:w="120" w:type="dxa"/>
-            </w:tcMar>
-          </w:tcPr>
-          <w:p>
-            <w:pPr>
-              <w:spacing w:after="0"/>
-            </w:pPr>
-            <w:r>
-              <w:rPr>
-                <w:sz w:val="14"/>
-              </w:rPr>
-              <w:t>India</w:t>
-            </w:r>
-          </w:p>
-        </w:tc>
-        <w:tc>
-          <w:tcPr>
-            <w:tcW w:type="dxa" w:w="1560"/>
-            <w:tcMar>
-              <w:top w:w="70" w:type="dxa"/>
-              <w:start w:w="120" w:type="dxa"/>
-              <w:bottom w:w="70" w:type="dxa"/>
-              <w:end w:w="120" w:type="dxa"/>
-            </w:tcMar>
-          </w:tcPr>
-          <w:p>
-            <w:pPr>
-              <w:spacing w:after="0"/>
-            </w:pPr>
-            <w:r>
-              <w:rPr>
-                <w:sz w:val="14"/>
-              </w:rPr>
-              <w:t>Export Manager / Organic Soybean Processing Sales / Raw Materials Buyer</w:t>
-            </w:r>
-          </w:p>
-        </w:tc>
-        <w:tc>
-          <w:tcPr>
-            <w:tcW w:type="dxa" w:w="1560"/>
-            <w:tcMar>
-              <w:top w:w="70" w:type="dxa"/>
-              <w:start w:w="120" w:type="dxa"/>
-              <w:bottom w:w="70" w:type="dxa"/>
-              <w:end w:w="120" w:type="dxa"/>
-            </w:tcMar>
-          </w:tcPr>
-          <w:p>
-            <w:pPr>
-              <w:spacing w:after="0"/>
-            </w:pPr>
-            <w:r>
-              <w:rPr>
-                <w:sz w:val="14"/>
-              </w:rPr>
-              <w:t>verified</w:t>
-            </w:r>
-          </w:p>
-        </w:tc>
-        <w:tc>
-          <w:tcPr>
-            <w:tcW w:type="dxa" w:w="1560"/>
-            <w:tcMar>
-              <w:top w:w="70" w:type="dxa"/>
-              <w:start w:w="120" w:type="dxa"/>
-              <w:bottom w:w="70" w:type="dxa"/>
-              <w:end w:w="120" w:type="dxa"/>
-            </w:tcMar>
-          </w:tcPr>
-          <w:p>
-            <w:pPr>
-              <w:spacing w:after="0"/>
-            </w:pPr>
-            <w:r>
-              <w:rPr>
-                <w:sz w:val="14"/>
-              </w:rPr>
-              <w:t>GOS-025</w:t>
-            </w:r>
-          </w:p>
-        </w:tc>
-      </w:tr>
-      <w:tr>
-        <w:tc>
-          <w:tcPr>
-            <w:tcW w:type="dxa" w:w="1560"/>
-            <w:tcMar>
-              <w:top w:w="70" w:type="dxa"/>
-              <w:start w:w="120" w:type="dxa"/>
-              <w:bottom w:w="70" w:type="dxa"/>
-              <w:end w:w="120" w:type="dxa"/>
-            </w:tcMar>
-          </w:tcPr>
-          <w:p>
-            <w:pPr>
-              <w:spacing w:after="0"/>
-            </w:pPr>
-            <w:r>
-              <w:rPr>
-                <w:sz w:val="14"/>
-              </w:rPr>
-              <w:t>hp@hanpel.com</w:t>
-            </w:r>
-          </w:p>
-        </w:tc>
-        <w:tc>
-          <w:tcPr>
-            <w:tcW w:type="dxa" w:w="1560"/>
-            <w:tcMar>
-              <w:top w:w="70" w:type="dxa"/>
-              <w:start w:w="120" w:type="dxa"/>
-              <w:bottom w:w="70" w:type="dxa"/>
-              <w:end w:w="120" w:type="dxa"/>
-            </w:tcMar>
-          </w:tcPr>
-          <w:p>
-            <w:pPr>
-              <w:spacing w:after="0"/>
-            </w:pPr>
-            <w:r>
-              <w:rPr>
-                <w:sz w:val="14"/>
-              </w:rPr>
-              <w:t>HANPEL TECH CO., LTD</w:t>
-            </w:r>
-          </w:p>
-        </w:tc>
-        <w:tc>
-          <w:tcPr>
-            <w:tcW w:type="dxa" w:w="1560"/>
-            <w:tcMar>
-              <w:top w:w="70" w:type="dxa"/>
-              <w:start w:w="120" w:type="dxa"/>
-              <w:bottom w:w="70" w:type="dxa"/>
-              <w:end w:w="120" w:type="dxa"/>
-            </w:tcMar>
-          </w:tcPr>
-          <w:p>
-            <w:pPr>
-              <w:spacing w:after="0"/>
-            </w:pPr>
-            <w:r>
-              <w:rPr>
-                <w:sz w:val="14"/>
-              </w:rPr>
-              <w:t>South Korea</w:t>
-            </w:r>
-          </w:p>
-        </w:tc>
-        <w:tc>
-          <w:tcPr>
-            <w:tcW w:type="dxa" w:w="1560"/>
-            <w:tcMar>
-              <w:top w:w="70" w:type="dxa"/>
-              <w:start w:w="120" w:type="dxa"/>
-              <w:bottom w:w="70" w:type="dxa"/>
-              <w:end w:w="120" w:type="dxa"/>
-            </w:tcMar>
-          </w:tcPr>
-          <w:p>
-            <w:pPr>
-              <w:spacing w:after="0"/>
-            </w:pPr>
-            <w:r>
-              <w:rPr>
-                <w:sz w:val="14"/>
-              </w:rPr>
-              <w:t>Purchasing Manager / Feed Ingredients Manager / Functional Protein Sales</w:t>
-            </w:r>
-          </w:p>
-        </w:tc>
-        <w:tc>
-          <w:tcPr>
-            <w:tcW w:type="dxa" w:w="1560"/>
-            <w:tcMar>
-              <w:top w:w="70" w:type="dxa"/>
-              <w:start w:w="120" w:type="dxa"/>
-              <w:bottom w:w="70" w:type="dxa"/>
-              <w:end w:w="120" w:type="dxa"/>
-            </w:tcMar>
-          </w:tcPr>
-          <w:p>
-            <w:pPr>
-              <w:spacing w:after="0"/>
-            </w:pPr>
-            <w:r>
-              <w:rPr>
-                <w:sz w:val="14"/>
-              </w:rPr>
-              <w:t>user_requested_verified</w:t>
-            </w:r>
-          </w:p>
-        </w:tc>
-        <w:tc>
-          <w:tcPr>
-            <w:tcW w:type="dxa" w:w="1560"/>
-            <w:tcMar>
-              <w:top w:w="70" w:type="dxa"/>
-              <w:start w:w="120" w:type="dxa"/>
-              <w:bottom w:w="70" w:type="dxa"/>
-              <w:end w:w="120" w:type="dxa"/>
-            </w:tcMar>
-          </w:tcPr>
-          <w:p>
-            <w:pPr>
-              <w:spacing w:after="0"/>
-            </w:pPr>
-            <w:r>
-              <w:rPr>
-                <w:sz w:val="14"/>
-              </w:rPr>
-              <w:t>GOS-026</w:t>
-            </w:r>
-          </w:p>
-        </w:tc>
-      </w:tr>
-      <w:tr>
-        <w:tc>
-          <w:tcPr>
-            <w:tcW w:type="dxa" w:w="1560"/>
-            <w:tcMar>
-              <w:top w:w="70" w:type="dxa"/>
-              <w:start w:w="120" w:type="dxa"/>
-              <w:bottom w:w="70" w:type="dxa"/>
-              <w:end w:w="120" w:type="dxa"/>
-            </w:tcMar>
-          </w:tcPr>
-          <w:p>
-            <w:pPr>
-              <w:spacing w:after="0"/>
-            </w:pPr>
-            <w:r>
-              <w:rPr>
-                <w:sz w:val="14"/>
-              </w:rPr>
-              <w:t>kings@k-ings.co.kr</w:t>
-            </w:r>
-          </w:p>
-        </w:tc>
-        <w:tc>
-          <w:tcPr>
-            <w:tcW w:type="dxa" w:w="1560"/>
-            <w:tcMar>
-              <w:top w:w="70" w:type="dxa"/>
-              <w:start w:w="120" w:type="dxa"/>
-              <w:bottom w:w="70" w:type="dxa"/>
-              <w:end w:w="120" w:type="dxa"/>
-            </w:tcMar>
-          </w:tcPr>
-          <w:p>
-            <w:pPr>
-              <w:spacing w:after="0"/>
-            </w:pPr>
-            <w:r>
-              <w:rPr>
-                <w:sz w:val="14"/>
-              </w:rPr>
-              <w:t>K-INGS Co., Ltd.</w:t>
-            </w:r>
-          </w:p>
-        </w:tc>
-        <w:tc>
-          <w:tcPr>
-            <w:tcW w:type="dxa" w:w="1560"/>
-            <w:tcMar>
-              <w:top w:w="70" w:type="dxa"/>
-              <w:start w:w="120" w:type="dxa"/>
-              <w:bottom w:w="70" w:type="dxa"/>
-              <w:end w:w="120" w:type="dxa"/>
-            </w:tcMar>
-          </w:tcPr>
-          <w:p>
-            <w:pPr>
-              <w:spacing w:after="0"/>
-            </w:pPr>
-            <w:r>
-              <w:rPr>
-                <w:sz w:val="14"/>
-              </w:rPr>
-              <w:t>South Korea</w:t>
-            </w:r>
-          </w:p>
-        </w:tc>
-        <w:tc>
-          <w:tcPr>
-            <w:tcW w:type="dxa" w:w="1560"/>
-            <w:tcMar>
-              <w:top w:w="70" w:type="dxa"/>
-              <w:start w:w="120" w:type="dxa"/>
-              <w:bottom w:w="70" w:type="dxa"/>
-              <w:end w:w="120" w:type="dxa"/>
-            </w:tcMar>
-          </w:tcPr>
-          <w:p>
-            <w:pPr>
-              <w:spacing w:after="0"/>
-            </w:pPr>
-            <w:r>
-              <w:rPr>
-                <w:sz w:val="14"/>
-              </w:rPr>
-              <w:t>Feed Raw Materials Buyer / Procurement Manager / Import Manager</w:t>
-            </w:r>
-          </w:p>
-        </w:tc>
-        <w:tc>
-          <w:tcPr>
-            <w:tcW w:type="dxa" w:w="1560"/>
-            <w:tcMar>
-              <w:top w:w="70" w:type="dxa"/>
-              <w:start w:w="120" w:type="dxa"/>
-              <w:bottom w:w="70" w:type="dxa"/>
-              <w:end w:w="120" w:type="dxa"/>
-            </w:tcMar>
-          </w:tcPr>
-          <w:p>
-            <w:pPr>
-              <w:spacing w:after="0"/>
-            </w:pPr>
-            <w:r>
-              <w:rPr>
-                <w:sz w:val="14"/>
-              </w:rPr>
-              <w:t>user_requested_verified</w:t>
-            </w:r>
-          </w:p>
-        </w:tc>
-        <w:tc>
-          <w:tcPr>
-            <w:tcW w:type="dxa" w:w="1560"/>
-            <w:tcMar>
-              <w:top w:w="70" w:type="dxa"/>
-              <w:start w:w="120" w:type="dxa"/>
-              <w:bottom w:w="70" w:type="dxa"/>
-              <w:end w:w="120" w:type="dxa"/>
-            </w:tcMar>
-          </w:tcPr>
-          <w:p>
-            <w:pPr>
-              <w:spacing w:after="0"/>
-            </w:pPr>
-            <w:r>
-              <w:rPr>
-                <w:sz w:val="14"/>
-              </w:rPr>
-              <w:t>GOS-027</w:t>
-            </w:r>
-          </w:p>
-        </w:tc>
-      </w:tr>
-      <w:tr>
-        <w:tc>
-          <w:tcPr>
-            <w:tcW w:type="dxa" w:w="1560"/>
-            <w:tcMar>
-              <w:top w:w="70" w:type="dxa"/>
-              <w:start w:w="120" w:type="dxa"/>
-              <w:bottom w:w="70" w:type="dxa"/>
-              <w:end w:w="120" w:type="dxa"/>
-            </w:tcMar>
-          </w:tcPr>
-          <w:p>
-            <w:pPr>
-              <w:spacing w:after="0"/>
-            </w:pPr>
-            <w:r>
-              <w:rPr>
-                <w:sz w:val="14"/>
-              </w:rPr>
-              <w:t>info@organex.com.pk</w:t>
-            </w:r>
-          </w:p>
-        </w:tc>
-        <w:tc>
-          <w:tcPr>
-            <w:tcW w:type="dxa" w:w="1560"/>
-            <w:tcMar>
-              <w:top w:w="70" w:type="dxa"/>
-              <w:start w:w="120" w:type="dxa"/>
-              <w:bottom w:w="70" w:type="dxa"/>
-              <w:end w:w="120" w:type="dxa"/>
-            </w:tcMar>
-          </w:tcPr>
-          <w:p>
-            <w:pPr>
-              <w:spacing w:after="0"/>
-            </w:pPr>
-            <w:r>
-              <w:rPr>
-                <w:sz w:val="14"/>
-              </w:rPr>
-              <w:t>Organex Pvt Ltd</w:t>
-            </w:r>
-          </w:p>
-        </w:tc>
-        <w:tc>
-          <w:tcPr>
-            <w:tcW w:type="dxa" w:w="1560"/>
-            <w:tcMar>
-              <w:top w:w="70" w:type="dxa"/>
-              <w:start w:w="120" w:type="dxa"/>
-              <w:bottom w:w="70" w:type="dxa"/>
-              <w:end w:w="120" w:type="dxa"/>
-            </w:tcMar>
-          </w:tcPr>
-          <w:p>
-            <w:pPr>
-              <w:spacing w:after="0"/>
-            </w:pPr>
-            <w:r>
-              <w:rPr>
-                <w:sz w:val="14"/>
-              </w:rPr>
-              <w:t>Pakistan</w:t>
-            </w:r>
-          </w:p>
-        </w:tc>
-        <w:tc>
-          <w:tcPr>
-            <w:tcW w:type="dxa" w:w="1560"/>
-            <w:tcMar>
-              <w:top w:w="70" w:type="dxa"/>
-              <w:start w:w="120" w:type="dxa"/>
-              <w:bottom w:w="70" w:type="dxa"/>
-              <w:end w:w="120" w:type="dxa"/>
-            </w:tcMar>
-          </w:tcPr>
-          <w:p>
-            <w:pPr>
-              <w:spacing w:after="0"/>
-            </w:pPr>
-            <w:r>
-              <w:rPr>
-                <w:sz w:val="14"/>
-              </w:rPr>
-              <w:t>Export Manager / Feed Ingredients Sales / Business Development</w:t>
-            </w:r>
-          </w:p>
-        </w:tc>
-        <w:tc>
-          <w:tcPr>
-            <w:tcW w:type="dxa" w:w="1560"/>
-            <w:tcMar>
-              <w:top w:w="70" w:type="dxa"/>
-              <w:start w:w="120" w:type="dxa"/>
-              <w:bottom w:w="70" w:type="dxa"/>
-              <w:end w:w="120" w:type="dxa"/>
-            </w:tcMar>
-          </w:tcPr>
-          <w:p>
-            <w:pPr>
-              <w:spacing w:after="0"/>
-            </w:pPr>
-            <w:r>
-              <w:rPr>
-                <w:sz w:val="14"/>
-              </w:rPr>
-              <w:t>user_requested_verified</w:t>
-            </w:r>
-          </w:p>
-        </w:tc>
-        <w:tc>
-          <w:tcPr>
-            <w:tcW w:type="dxa" w:w="1560"/>
-            <w:tcMar>
-              <w:top w:w="70" w:type="dxa"/>
-              <w:start w:w="120" w:type="dxa"/>
-              <w:bottom w:w="70" w:type="dxa"/>
-              <w:end w:w="120" w:type="dxa"/>
-            </w:tcMar>
-          </w:tcPr>
-          <w:p>
-            <w:pPr>
-              <w:spacing w:after="0"/>
-            </w:pPr>
-            <w:r>
-              <w:rPr>
-                <w:sz w:val="14"/>
-              </w:rPr>
-              <w:t>GOS-028</w:t>
-            </w:r>
-          </w:p>
-        </w:tc>
-      </w:tr>
-      <w:tr>
-        <w:tc>
-          <w:tcPr>
-            <w:tcW w:type="dxa" w:w="1560"/>
-            <w:tcMar>
-              <w:top w:w="70" w:type="dxa"/>
-              <w:start w:w="120" w:type="dxa"/>
-              <w:bottom w:w="70" w:type="dxa"/>
-              <w:end w:w="120" w:type="dxa"/>
-            </w:tcMar>
-          </w:tcPr>
-          <w:p>
-            <w:pPr>
-              <w:spacing w:after="0"/>
-            </w:pPr>
-            <w:r>
-              <w:rPr>
-                <w:sz w:val="14"/>
-              </w:rPr>
-              <w:t>toi@khalisgroup.com</w:t>
-            </w:r>
-          </w:p>
-        </w:tc>
-        <w:tc>
-          <w:tcPr>
-            <w:tcW w:type="dxa" w:w="1560"/>
-            <w:tcMar>
-              <w:top w:w="70" w:type="dxa"/>
-              <w:start w:w="120" w:type="dxa"/>
-              <w:bottom w:w="70" w:type="dxa"/>
-              <w:end w:w="120" w:type="dxa"/>
-            </w:tcMar>
-          </w:tcPr>
-          <w:p>
-            <w:pPr>
-              <w:spacing w:after="0"/>
-            </w:pPr>
-            <w:r>
-              <w:rPr>
-                <w:sz w:val="14"/>
-              </w:rPr>
-              <w:t>Khalis Manufacturing / Khalis Group</w:t>
-            </w:r>
-          </w:p>
-        </w:tc>
-        <w:tc>
-          <w:tcPr>
-            <w:tcW w:type="dxa" w:w="1560"/>
-            <w:tcMar>
-              <w:top w:w="70" w:type="dxa"/>
-              <w:start w:w="120" w:type="dxa"/>
-              <w:bottom w:w="70" w:type="dxa"/>
-              <w:end w:w="120" w:type="dxa"/>
-            </w:tcMar>
-          </w:tcPr>
-          <w:p>
-            <w:pPr>
-              <w:spacing w:after="0"/>
-            </w:pPr>
-            <w:r>
-              <w:rPr>
-                <w:sz w:val="14"/>
-              </w:rPr>
-              <w:t>Pakistan</w:t>
-            </w:r>
-          </w:p>
-        </w:tc>
-        <w:tc>
-          <w:tcPr>
-            <w:tcW w:type="dxa" w:w="1560"/>
-            <w:tcMar>
-              <w:top w:w="70" w:type="dxa"/>
-              <w:start w:w="120" w:type="dxa"/>
-              <w:bottom w:w="70" w:type="dxa"/>
-              <w:end w:w="120" w:type="dxa"/>
-            </w:tcMar>
-          </w:tcPr>
-          <w:p>
-            <w:pPr>
-              <w:spacing w:after="0"/>
-            </w:pPr>
-            <w:r>
-              <w:rPr>
-                <w:sz w:val="14"/>
-              </w:rPr>
-              <w:t>Raw Materials Procurement / Export Sales / Oilseed Processing Manager</w:t>
-            </w:r>
-          </w:p>
-        </w:tc>
-        <w:tc>
-          <w:tcPr>
-            <w:tcW w:type="dxa" w:w="1560"/>
-            <w:tcMar>
-              <w:top w:w="70" w:type="dxa"/>
-              <w:start w:w="120" w:type="dxa"/>
-              <w:bottom w:w="70" w:type="dxa"/>
-              <w:end w:w="120" w:type="dxa"/>
-            </w:tcMar>
-          </w:tcPr>
-          <w:p>
-            <w:pPr>
-              <w:spacing w:after="0"/>
-            </w:pPr>
-            <w:r>
-              <w:rPr>
-                <w:sz w:val="14"/>
-              </w:rPr>
-              <w:t>user_requested_verified</w:t>
-            </w:r>
-          </w:p>
-        </w:tc>
-        <w:tc>
-          <w:tcPr>
-            <w:tcW w:type="dxa" w:w="1560"/>
-            <w:tcMar>
-              <w:top w:w="70" w:type="dxa"/>
-              <w:start w:w="120" w:type="dxa"/>
-              <w:bottom w:w="70" w:type="dxa"/>
-              <w:end w:w="120" w:type="dxa"/>
-            </w:tcMar>
-          </w:tcPr>
-          <w:p>
-            <w:pPr>
-              <w:spacing w:after="0"/>
-            </w:pPr>
-            <w:r>
-              <w:rPr>
-                <w:sz w:val="14"/>
-              </w:rPr>
-              <w:t>GOS-029</w:t>
-            </w:r>
-          </w:p>
-        </w:tc>
-      </w:tr>
-      <w:tr>
-        <w:tc>
-          <w:tcPr>
-            <w:tcW w:type="dxa" w:w="1560"/>
-            <w:tcMar>
-              <w:top w:w="70" w:type="dxa"/>
-              <w:start w:w="120" w:type="dxa"/>
-              <w:bottom w:w="70" w:type="dxa"/>
-              <w:end w:w="120" w:type="dxa"/>
-            </w:tcMar>
-          </w:tcPr>
-          <w:p>
-            <w:pPr>
-              <w:spacing w:after="0"/>
-            </w:pPr>
-            <w:r>
-              <w:rPr>
-                <w:sz w:val="14"/>
-              </w:rPr>
-              <w:t>supply@greenmiller.com</w:t>
-            </w:r>
-          </w:p>
-        </w:tc>
-        <w:tc>
-          <w:tcPr>
-            <w:tcW w:type="dxa" w:w="1560"/>
-            <w:tcMar>
-              <w:top w:w="70" w:type="dxa"/>
-              <w:start w:w="120" w:type="dxa"/>
-              <w:bottom w:w="70" w:type="dxa"/>
-              <w:end w:w="120" w:type="dxa"/>
-            </w:tcMar>
-          </w:tcPr>
-          <w:p>
-            <w:pPr>
-              <w:spacing w:after="0"/>
-            </w:pPr>
-            <w:r>
-              <w:rPr>
-                <w:sz w:val="14"/>
-              </w:rPr>
-              <w:t>Green Miller International</w:t>
-            </w:r>
-          </w:p>
-        </w:tc>
-        <w:tc>
-          <w:tcPr>
-            <w:tcW w:type="dxa" w:w="1560"/>
-            <w:tcMar>
-              <w:top w:w="70" w:type="dxa"/>
-              <w:start w:w="120" w:type="dxa"/>
-              <w:bottom w:w="70" w:type="dxa"/>
-              <w:end w:w="120" w:type="dxa"/>
-            </w:tcMar>
-          </w:tcPr>
-          <w:p>
-            <w:pPr>
-              <w:spacing w:after="0"/>
-            </w:pPr>
-            <w:r>
-              <w:rPr>
-                <w:sz w:val="14"/>
-              </w:rPr>
-              <w:t>India</w:t>
-            </w:r>
-          </w:p>
-        </w:tc>
-        <w:tc>
-          <w:tcPr>
-            <w:tcW w:type="dxa" w:w="1560"/>
-            <w:tcMar>
-              <w:top w:w="70" w:type="dxa"/>
-              <w:start w:w="120" w:type="dxa"/>
-              <w:bottom w:w="70" w:type="dxa"/>
-              <w:end w:w="120" w:type="dxa"/>
-            </w:tcMar>
-          </w:tcPr>
-          <w:p>
-            <w:pPr>
-              <w:spacing w:after="0"/>
-            </w:pPr>
-            <w:r>
-              <w:rPr>
-                <w:sz w:val="14"/>
-              </w:rPr>
-              <w:t>Supply Manager / Export Sales Manager / Organic Feed Ingredients Sales</w:t>
-            </w:r>
-          </w:p>
-        </w:tc>
-        <w:tc>
-          <w:tcPr>
-            <w:tcW w:type="dxa" w:w="1560"/>
-            <w:tcMar>
-              <w:top w:w="70" w:type="dxa"/>
-              <w:start w:w="120" w:type="dxa"/>
-              <w:bottom w:w="70" w:type="dxa"/>
-              <w:end w:w="120" w:type="dxa"/>
-            </w:tcMar>
-          </w:tcPr>
-          <w:p>
-            <w:pPr>
-              <w:spacing w:after="0"/>
-            </w:pPr>
-            <w:r>
-              <w:rPr>
-                <w:sz w:val="14"/>
-              </w:rPr>
-              <w:t>needs_follow_up</w:t>
-            </w:r>
-          </w:p>
-        </w:tc>
-        <w:tc>
-          <w:tcPr>
-            <w:tcW w:type="dxa" w:w="1560"/>
-            <w:tcMar>
-              <w:top w:w="70" w:type="dxa"/>
-              <w:start w:w="120" w:type="dxa"/>
-              <w:bottom w:w="70" w:type="dxa"/>
-              <w:end w:w="120" w:type="dxa"/>
-            </w:tcMar>
-          </w:tcPr>
-          <w:p>
-            <w:pPr>
-              <w:spacing w:after="0"/>
-            </w:pPr>
-            <w:r>
-              <w:rPr>
-                <w:sz w:val="14"/>
-              </w:rPr>
-              <w:t>-</w:t>
-            </w:r>
-          </w:p>
-        </w:tc>
-      </w:tr>
-      <w:tr>
-        <w:tc>
-          <w:tcPr>
-            <w:tcW w:type="dxa" w:w="1560"/>
-            <w:tcMar>
-              <w:top w:w="70" w:type="dxa"/>
-              <w:start w:w="120" w:type="dxa"/>
-              <w:bottom w:w="70" w:type="dxa"/>
-              <w:end w:w="120" w:type="dxa"/>
-            </w:tcMar>
-          </w:tcPr>
-          <w:p>
-            <w:pPr>
-              <w:spacing w:after="0"/>
-            </w:pPr>
-            <w:r>
-              <w:rPr>
-                <w:sz w:val="14"/>
-              </w:rPr>
-              <w:t>anirudh@earthbiochem.com</w:t>
-            </w:r>
-          </w:p>
-        </w:tc>
-        <w:tc>
-          <w:tcPr>
-            <w:tcW w:type="dxa" w:w="1560"/>
-            <w:tcMar>
-              <w:top w:w="70" w:type="dxa"/>
-              <w:start w:w="120" w:type="dxa"/>
-              <w:bottom w:w="70" w:type="dxa"/>
-              <w:end w:w="120" w:type="dxa"/>
-            </w:tcMar>
-          </w:tcPr>
-          <w:p>
-            <w:pPr>
-              <w:spacing w:after="0"/>
-            </w:pPr>
-            <w:r>
-              <w:rPr>
-                <w:sz w:val="14"/>
-              </w:rPr>
-              <w:t>Earth Biochem</w:t>
-            </w:r>
-          </w:p>
-        </w:tc>
-        <w:tc>
-          <w:tcPr>
-            <w:tcW w:type="dxa" w:w="1560"/>
-            <w:tcMar>
-              <w:top w:w="70" w:type="dxa"/>
-              <w:start w:w="120" w:type="dxa"/>
-              <w:bottom w:w="70" w:type="dxa"/>
-              <w:end w:w="120" w:type="dxa"/>
-            </w:tcMar>
-          </w:tcPr>
-          <w:p>
-            <w:pPr>
-              <w:spacing w:after="0"/>
-            </w:pPr>
-            <w:r>
-              <w:rPr>
-                <w:sz w:val="14"/>
-              </w:rPr>
-              <w:t>India</w:t>
-            </w:r>
-          </w:p>
-        </w:tc>
-        <w:tc>
-          <w:tcPr>
-            <w:tcW w:type="dxa" w:w="1560"/>
-            <w:tcMar>
-              <w:top w:w="70" w:type="dxa"/>
-              <w:start w:w="120" w:type="dxa"/>
-              <w:bottom w:w="70" w:type="dxa"/>
-              <w:end w:w="120" w:type="dxa"/>
-            </w:tcMar>
-          </w:tcPr>
-          <w:p>
-            <w:pPr>
-              <w:spacing w:after="0"/>
-            </w:pPr>
-            <w:r>
-              <w:rPr>
-                <w:sz w:val="14"/>
-              </w:rPr>
-              <w:t>Export Manager / Organic Soy Meal Sales / Business Development</w:t>
-            </w:r>
-          </w:p>
-        </w:tc>
-        <w:tc>
-          <w:tcPr>
-            <w:tcW w:type="dxa" w:w="1560"/>
-            <w:tcMar>
-              <w:top w:w="70" w:type="dxa"/>
-              <w:start w:w="120" w:type="dxa"/>
-              <w:bottom w:w="70" w:type="dxa"/>
-              <w:end w:w="120" w:type="dxa"/>
-            </w:tcMar>
-          </w:tcPr>
-          <w:p>
-            <w:pPr>
-              <w:spacing w:after="0"/>
-            </w:pPr>
-            <w:r>
-              <w:rPr>
-                <w:sz w:val="14"/>
-              </w:rPr>
-              <w:t>needs_follow_up</w:t>
-            </w:r>
-          </w:p>
-        </w:tc>
-        <w:tc>
-          <w:tcPr>
-            <w:tcW w:type="dxa" w:w="1560"/>
-            <w:tcMar>
-              <w:top w:w="70" w:type="dxa"/>
-              <w:start w:w="120" w:type="dxa"/>
-              <w:bottom w:w="70" w:type="dxa"/>
-              <w:end w:w="120" w:type="dxa"/>
-            </w:tcMar>
-          </w:tcPr>
-          <w:p>
-            <w:pPr>
-              <w:spacing w:after="0"/>
-            </w:pPr>
-            <w:r>
-              <w:rPr>
-                <w:sz w:val="14"/>
-              </w:rPr>
-              <w:t>-</w:t>
-            </w:r>
-          </w:p>
-        </w:tc>
-      </w:tr>
-      <w:tr>
-        <w:tc>
-          <w:tcPr>
-            <w:tcW w:type="dxa" w:w="1560"/>
-            <w:tcMar>
-              <w:top w:w="70" w:type="dxa"/>
-              <w:start w:w="120" w:type="dxa"/>
-              <w:bottom w:w="70" w:type="dxa"/>
-              <w:end w:w="120" w:type="dxa"/>
-            </w:tcMar>
-          </w:tcPr>
-          <w:p>
-            <w:pPr>
-              <w:spacing w:after="0"/>
-            </w:pPr>
-            <w:r>
-              <w:rPr>
-                <w:sz w:val="14"/>
-              </w:rPr>
-              <w:t>info@earthbiochem.com</w:t>
-            </w:r>
-          </w:p>
-        </w:tc>
-        <w:tc>
-          <w:tcPr>
-            <w:tcW w:type="dxa" w:w="1560"/>
-            <w:tcMar>
-              <w:top w:w="70" w:type="dxa"/>
-              <w:start w:w="120" w:type="dxa"/>
-              <w:bottom w:w="70" w:type="dxa"/>
-              <w:end w:w="120" w:type="dxa"/>
-            </w:tcMar>
-          </w:tcPr>
-          <w:p>
-            <w:pPr>
-              <w:spacing w:after="0"/>
-            </w:pPr>
-            <w:r>
-              <w:rPr>
-                <w:sz w:val="14"/>
-              </w:rPr>
-              <w:t>Earth Biochem</w:t>
-            </w:r>
-          </w:p>
-        </w:tc>
-        <w:tc>
-          <w:tcPr>
-            <w:tcW w:type="dxa" w:w="1560"/>
-            <w:tcMar>
-              <w:top w:w="70" w:type="dxa"/>
-              <w:start w:w="120" w:type="dxa"/>
-              <w:bottom w:w="70" w:type="dxa"/>
-              <w:end w:w="120" w:type="dxa"/>
-            </w:tcMar>
-          </w:tcPr>
-          <w:p>
-            <w:pPr>
-              <w:spacing w:after="0"/>
-            </w:pPr>
-            <w:r>
-              <w:rPr>
-                <w:sz w:val="14"/>
-              </w:rPr>
-              <w:t>India</w:t>
-            </w:r>
-          </w:p>
-        </w:tc>
-        <w:tc>
-          <w:tcPr>
-            <w:tcW w:type="dxa" w:w="1560"/>
-            <w:tcMar>
-              <w:top w:w="70" w:type="dxa"/>
-              <w:start w:w="120" w:type="dxa"/>
-              <w:bottom w:w="70" w:type="dxa"/>
-              <w:end w:w="120" w:type="dxa"/>
-            </w:tcMar>
-          </w:tcPr>
-          <w:p>
-            <w:pPr>
-              <w:spacing w:after="0"/>
-            </w:pPr>
-            <w:r>
-              <w:rPr>
-                <w:sz w:val="14"/>
-              </w:rPr>
-              <w:t>Export Manager / Organic Soy Meal Sales / Business Development</w:t>
-            </w:r>
-          </w:p>
-        </w:tc>
-        <w:tc>
-          <w:tcPr>
-            <w:tcW w:type="dxa" w:w="1560"/>
-            <w:tcMar>
-              <w:top w:w="70" w:type="dxa"/>
-              <w:start w:w="120" w:type="dxa"/>
-              <w:bottom w:w="70" w:type="dxa"/>
-              <w:end w:w="120" w:type="dxa"/>
-            </w:tcMar>
-          </w:tcPr>
-          <w:p>
-            <w:pPr>
-              <w:spacing w:after="0"/>
-            </w:pPr>
-            <w:r>
-              <w:rPr>
-                <w:sz w:val="14"/>
-              </w:rPr>
-              <w:t>needs_follow_up</w:t>
-            </w:r>
-          </w:p>
-        </w:tc>
-        <w:tc>
-          <w:tcPr>
-            <w:tcW w:type="dxa" w:w="1560"/>
-            <w:tcMar>
-              <w:top w:w="70" w:type="dxa"/>
-              <w:start w:w="120" w:type="dxa"/>
-              <w:bottom w:w="70" w:type="dxa"/>
-              <w:end w:w="120" w:type="dxa"/>
-            </w:tcMar>
-          </w:tcPr>
-          <w:p>
-            <w:pPr>
-              <w:spacing w:after="0"/>
-            </w:pPr>
-            <w:r>
-              <w:rPr>
-                <w:sz w:val="14"/>
-              </w:rPr>
-              <w:t>-</w:t>
-            </w:r>
-          </w:p>
-        </w:tc>
-      </w:tr>
-      <w:tr>
-        <w:tc>
-          <w:tcPr>
-            <w:tcW w:type="dxa" w:w="1560"/>
-            <w:tcMar>
-              <w:top w:w="70" w:type="dxa"/>
-              <w:start w:w="120" w:type="dxa"/>
-              <w:bottom w:w="70" w:type="dxa"/>
-              <w:end w:w="120" w:type="dxa"/>
-            </w:tcMar>
-          </w:tcPr>
-          <w:p>
-            <w:pPr>
-              <w:spacing w:after="0"/>
-            </w:pPr>
-            <w:r>
-              <w:rPr>
-                <w:sz w:val="14"/>
-              </w:rPr>
-              <w:t>support@svfsoya.com</w:t>
-            </w:r>
-          </w:p>
-        </w:tc>
-        <w:tc>
-          <w:tcPr>
-            <w:tcW w:type="dxa" w:w="1560"/>
-            <w:tcMar>
-              <w:top w:w="70" w:type="dxa"/>
-              <w:start w:w="120" w:type="dxa"/>
-              <w:bottom w:w="70" w:type="dxa"/>
-              <w:end w:w="120" w:type="dxa"/>
-            </w:tcMar>
-          </w:tcPr>
-          <w:p>
-            <w:pPr>
-              <w:spacing w:after="0"/>
-            </w:pPr>
-            <w:r>
-              <w:rPr>
-                <w:sz w:val="14"/>
-              </w:rPr>
-              <w:t>SVF Soya Pvt. Ltd.</w:t>
-            </w:r>
-          </w:p>
-        </w:tc>
-        <w:tc>
-          <w:tcPr>
-            <w:tcW w:type="dxa" w:w="1560"/>
-            <w:tcMar>
-              <w:top w:w="70" w:type="dxa"/>
-              <w:start w:w="120" w:type="dxa"/>
-              <w:bottom w:w="70" w:type="dxa"/>
-              <w:end w:w="120" w:type="dxa"/>
-            </w:tcMar>
-          </w:tcPr>
-          <w:p>
-            <w:pPr>
-              <w:spacing w:after="0"/>
-            </w:pPr>
-            <w:r>
-              <w:rPr>
-                <w:sz w:val="14"/>
-              </w:rPr>
-              <w:t>India</w:t>
-            </w:r>
-          </w:p>
-        </w:tc>
-        <w:tc>
-          <w:tcPr>
-            <w:tcW w:type="dxa" w:w="1560"/>
-            <w:tcMar>
-              <w:top w:w="70" w:type="dxa"/>
-              <w:start w:w="120" w:type="dxa"/>
-              <w:bottom w:w="70" w:type="dxa"/>
-              <w:end w:w="120" w:type="dxa"/>
-            </w:tcMar>
-          </w:tcPr>
-          <w:p>
-            <w:pPr>
-              <w:spacing w:after="0"/>
-            </w:pPr>
-            <w:r>
-              <w:rPr>
-                <w:sz w:val="14"/>
-              </w:rPr>
-              <w:t>Sales Manager / Feed Ingredients Sales / Procurement Manager</w:t>
-            </w:r>
-          </w:p>
-        </w:tc>
-        <w:tc>
-          <w:tcPr>
-            <w:tcW w:type="dxa" w:w="1560"/>
-            <w:tcMar>
-              <w:top w:w="70" w:type="dxa"/>
-              <w:start w:w="120" w:type="dxa"/>
-              <w:bottom w:w="70" w:type="dxa"/>
-              <w:end w:w="120" w:type="dxa"/>
-            </w:tcMar>
-          </w:tcPr>
-          <w:p>
-            <w:pPr>
-              <w:spacing w:after="0"/>
-            </w:pPr>
-            <w:r>
-              <w:rPr>
-                <w:sz w:val="14"/>
-              </w:rPr>
-              <w:t>needs_follow_up</w:t>
-            </w:r>
-          </w:p>
-        </w:tc>
-        <w:tc>
-          <w:tcPr>
-            <w:tcW w:type="dxa" w:w="1560"/>
-            <w:tcMar>
-              <w:top w:w="70" w:type="dxa"/>
-              <w:start w:w="120" w:type="dxa"/>
-              <w:bottom w:w="70" w:type="dxa"/>
-              <w:end w:w="120" w:type="dxa"/>
-            </w:tcMar>
-          </w:tcPr>
-          <w:p>
-            <w:pPr>
-              <w:spacing w:after="0"/>
-            </w:pPr>
-            <w:r>
-              <w:rPr>
-                <w:sz w:val="14"/>
-              </w:rPr>
-              <w:t>-</w:t>
-            </w:r>
-          </w:p>
-        </w:tc>
-      </w:tr>
-    </w:tbl>
+    <w:p>
+      <w:r>
+        <w:t>oelmuehle@vfi-oilsforlife.com</w:t>
+      </w:r>
+    </w:p>
+    <w:p>
+      <w:r>
+        <w:t>eric@simmonsgrain.com</w:t>
+      </w:r>
+    </w:p>
+    <w:p>
+      <w:r>
+        <w:t>annette@simmonsgrain.com</w:t>
+      </w:r>
+    </w:p>
+    <w:p>
+      <w:r>
+        <w:t>info@boydstation.com</w:t>
+      </w:r>
+    </w:p>
+    <w:p>
+      <w:r>
+        <w:t>rford@boydstation.com</w:t>
+      </w:r>
+    </w:p>
+    <w:p>
+      <w:r>
+        <w:t>info@caprockgrain.com</w:t>
+      </w:r>
+    </w:p>
+    <w:p>
+      <w:r>
+        <w:t>tianwei@tianweibiotech.com</w:t>
+      </w:r>
+    </w:p>
+    <w:p>
+      <w:r>
+        <w:t>export@tianweibiotech.com</w:t>
+      </w:r>
+    </w:p>
+    <w:p>
+      <w:r>
+        <w:t>info@naturebiofoods.organic</w:t>
+      </w:r>
+    </w:p>
+    <w:p>
+      <w:r>
+        <w:t>helpdesk@anandagro.com</w:t>
+      </w:r>
+    </w:p>
+    <w:p>
+      <w:r>
+        <w:t>hp@hanpel.com</w:t>
+      </w:r>
+    </w:p>
+    <w:p>
+      <w:r>
+        <w:t>kings@k-ings.co.kr</w:t>
+      </w:r>
+    </w:p>
+    <w:p>
+      <w:r>
+        <w:t>info@organex.com.pk</w:t>
+      </w:r>
+    </w:p>
+    <w:p>
+      <w:r>
+        <w:t>toi@khalisgroup.com</w:t>
+      </w:r>
+    </w:p>
+    <w:p>
+      <w:r>
+        <w:t>supply@greenmiller.com</w:t>
+      </w:r>
+    </w:p>
+    <w:p>
+      <w:r>
+        <w:t>anirudh@earthbiochem.com</w:t>
+      </w:r>
+    </w:p>
+    <w:p>
+      <w:r>
+        <w:t>info@earthbiochem.com</w:t>
+      </w:r>
+    </w:p>
+    <w:p>
+      <w:r>
+        <w:t>support@svfsoya.com</w:t>
+      </w:r>
+    </w:p>
     <w:sectPr>
       <w:pgSz w:w="12240" w:h="15840"/>
-      <w:pgMar w:top="1440" w:right="1440" w:bottom="1440" w:left="1440" w:header="708" w:footer="708" w:gutter="0"/>
+      <w:pgMar w:top="1440" w:right="1440" w:bottom="1440" w:left="1440" w:header="720" w:footer="720" w:gutter="0"/>
       <w:cols w:space="720"/>
       <w:docGrid w:linePitch="360"/>
     </w:sectPr>
@@ -3626,7 +481,7 @@
     <w:qFormat/>
     <w:rsid w:val="00FC693F"/>
     <w:pPr>
-      <w:spacing w:after="120" w:line="300" w:lineRule="auto"/>
+      <w:spacing w:after="80"/>
     </w:pPr>
     <w:rPr>
       <w:rFonts w:ascii="Calibri" w:hAnsi="Calibri"/>
@@ -3688,15 +543,15 @@
     <w:pPr>
       <w:keepNext/>
       <w:keepLines/>
-      <w:spacing w:before="360" w:after="200" w:line="300" w:lineRule="auto"/>
+      <w:spacing w:before="480" w:after="0"/>
       <w:outlineLvl w:val="0"/>
     </w:pPr>
     <w:rPr>
-      <w:rFonts w:asciiTheme="majorHAnsi" w:eastAsiaTheme="majorEastAsia" w:hAnsiTheme="majorHAnsi" w:cstheme="majorBidi" w:ascii="Calibri" w:hAnsi="Calibri"/>
+      <w:rFonts w:asciiTheme="majorHAnsi" w:eastAsiaTheme="majorEastAsia" w:hAnsiTheme="majorHAnsi" w:cstheme="majorBidi"/>
       <w:b/>
       <w:bCs/>
-      <w:color w:val="2E74B5"/>
-      <w:sz w:val="32"/>
+      <w:color w:val="365F91" w:themeColor="accent1" w:themeShade="BF"/>
+      <w:sz w:val="28"/>
       <w:szCs w:val="28"/>
     </w:rPr>
   </w:style>
@@ -3712,14 +567,14 @@
     <w:pPr>
       <w:keepNext/>
       <w:keepLines/>
-      <w:spacing w:before="280" w:after="140" w:line="300" w:lineRule="auto"/>
+      <w:spacing w:before="200" w:after="0"/>
       <w:outlineLvl w:val="1"/>
     </w:pPr>
     <w:rPr>
-      <w:rFonts w:asciiTheme="majorHAnsi" w:eastAsiaTheme="majorEastAsia" w:hAnsiTheme="majorHAnsi" w:cstheme="majorBidi" w:ascii="Calibri" w:hAnsi="Calibri"/>
+      <w:rFonts w:asciiTheme="majorHAnsi" w:eastAsiaTheme="majorEastAsia" w:hAnsiTheme="majorHAnsi" w:cstheme="majorBidi"/>
       <w:b/>
       <w:bCs/>
-      <w:color w:val="2E74B5"/>
+      <w:color w:val="4F81BD" w:themeColor="accent1"/>
       <w:sz w:val="26"/>
       <w:szCs w:val="26"/>
     </w:rPr>
@@ -3736,15 +591,14 @@
     <w:pPr>
       <w:keepNext/>
       <w:keepLines/>
-      <w:spacing w:before="200" w:after="100" w:line="300" w:lineRule="auto"/>
+      <w:spacing w:before="200" w:after="0"/>
       <w:outlineLvl w:val="2"/>
     </w:pPr>
     <w:rPr>
-      <w:rFonts w:asciiTheme="majorHAnsi" w:eastAsiaTheme="majorEastAsia" w:hAnsiTheme="majorHAnsi" w:cstheme="majorBidi" w:ascii="Calibri" w:hAnsi="Calibri"/>
+      <w:rFonts w:asciiTheme="majorHAnsi" w:eastAsiaTheme="majorEastAsia" w:hAnsiTheme="majorHAnsi" w:cstheme="majorBidi"/>
       <w:b/>
       <w:bCs/>
-      <w:color w:val="1F4D78"/>
-      <w:sz w:val="24"/>
+      <w:color w:val="4F81BD" w:themeColor="accent1"/>
     </w:rPr>
   </w:style>
   <w:style w:type="paragraph" w:styleId="Heading4">

</xml_diff>